<commit_message>
docs: add diagnosis categories and confidence score definitions (auth:imquaye)
</commit_message>
<xml_diff>
--- a/docs/KE DELIVERABLE.docx
+++ b/docs/KE DELIVERABLE.docx
@@ -374,6 +374,658 @@
       <w:r>
         <w:t>Fi network is not visible, the device cannot connect to the network, or the device connects but the internet does not work. The system attempts to identify the most likely cause of the problem based on user responses.</w:t>
       </w:r>
+    </w:p>
+    <w:p>
+      <w:pPr>
+        <w:pStyle w:val="Heading2"/>
+        <w:spacing w:line="360" w:lineRule="auto"/>
+        <w:ind w:left="365" w:firstLine="0"/>
+        <w:rPr>
+          <w:rStyle w:val="Heading1Char"/>
+          <w:rFonts w:ascii="Times New Roman" w:hAnsi="Times New Roman" w:cs="Times New Roman"/>
+          <w:b/>
+        </w:rPr>
+      </w:pPr>
+      <w:bookmarkStart w:id="2" w:name="_Toc223968943"/>
+      <w:r>
+        <w:rPr>
+          <w:rStyle w:val="Heading1Char"/>
+          <w:rFonts w:ascii="Times New Roman" w:hAnsi="Times New Roman" w:cs="Times New Roman"/>
+          <w:b/>
+        </w:rPr>
+        <w:lastRenderedPageBreak/>
+        <w:t>FINAL DIAGNOSIS AND CONFIDENCE SCORES</w:t>
+      </w:r>
+      <w:bookmarkEnd w:id="2"/>
+    </w:p>
+    <w:p/>
+    <w:p>
+      <w:pPr>
+        <w:spacing w:after="291" w:line="360" w:lineRule="auto"/>
+        <w:ind w:left="365" w:firstLine="0"/>
+      </w:pPr>
+      <w:r>
+        <w:t>The names assigned to conditions remain constant throughout the diagnosis process to maintain consistency within the knowledge base. Each condition is associated with a confidence score that represents the degree of certainty about the relationship between the observed symptoms and the possible diagnosis. In this system, the confidence scores are assigned based on the judgement and experience of domain experts, who estimate how strongly certain symptoms indicate certain conditions. These values serve as a measure of belief in the rules defined within the system. Although the scores are initially determined through expert knowledge rather than strict mathematical computation, they may be reviewed and adjusted over time as new knowledge about the domain becomes available or as improvements are made to the system.</w:t>
+      </w:r>
+    </w:p>
+    <w:p>
+      <w:pPr>
+        <w:spacing w:after="291" w:line="360" w:lineRule="auto"/>
+        <w:ind w:left="365" w:firstLine="0"/>
+      </w:pPr>
+    </w:p>
+    <w:p>
+      <w:pPr>
+        <w:spacing w:after="291" w:line="360" w:lineRule="auto"/>
+        <w:ind w:left="365" w:firstLine="0"/>
+      </w:pPr>
+    </w:p>
+    <w:p>
+      <w:pPr>
+        <w:spacing w:after="291" w:line="360" w:lineRule="auto"/>
+        <w:ind w:left="365" w:firstLine="0"/>
+      </w:pPr>
+    </w:p>
+    <w:p>
+      <w:pPr>
+        <w:spacing w:after="291" w:line="360" w:lineRule="auto"/>
+        <w:ind w:left="365" w:firstLine="0"/>
+      </w:pPr>
+    </w:p>
+    <w:p>
+      <w:pPr>
+        <w:spacing w:after="291" w:line="360" w:lineRule="auto"/>
+        <w:ind w:left="365" w:firstLine="0"/>
+      </w:pPr>
+    </w:p>
+    <w:tbl>
+      <w:tblPr>
+        <w:tblStyle w:val="TableGrid"/>
+        <w:tblW w:w="10490" w:type="dxa"/>
+        <w:tblInd w:w="-572" w:type="dxa"/>
+        <w:tblCellMar>
+          <w:top w:w="247" w:type="dxa"/>
+          <w:left w:w="108" w:type="dxa"/>
+          <w:right w:w="50" w:type="dxa"/>
+        </w:tblCellMar>
+        <w:tblLook w:val="04A0" w:firstRow="1" w:lastRow="0" w:firstColumn="1" w:lastColumn="0" w:noHBand="0" w:noVBand="1"/>
+      </w:tblPr>
+      <w:tblGrid>
+        <w:gridCol w:w="2127"/>
+        <w:gridCol w:w="5528"/>
+        <w:gridCol w:w="2835"/>
+      </w:tblGrid>
+      <w:tr>
+        <w:trPr>
+          <w:trHeight w:val="723"/>
+        </w:trPr>
+        <w:tc>
+          <w:tcPr>
+            <w:tcW w:w="2127" w:type="dxa"/>
+            <w:tcBorders>
+              <w:top w:val="single" w:sz="4" w:space="0" w:color="000000"/>
+              <w:left w:val="single" w:sz="4" w:space="0" w:color="000000"/>
+              <w:bottom w:val="single" w:sz="4" w:space="0" w:color="000000"/>
+              <w:right w:val="single" w:sz="4" w:space="0" w:color="000000"/>
+            </w:tcBorders>
+          </w:tcPr>
+          <w:p>
+            <w:pPr>
+              <w:spacing w:after="0" w:line="360" w:lineRule="auto"/>
+              <w:ind w:left="0" w:firstLine="0"/>
+            </w:pPr>
+            <w:r>
+              <w:rPr>
+                <w:b/>
+              </w:rPr>
+              <w:t xml:space="preserve"> </w:t>
+            </w:r>
+          </w:p>
+        </w:tc>
+        <w:tc>
+          <w:tcPr>
+            <w:tcW w:w="5528" w:type="dxa"/>
+            <w:tcBorders>
+              <w:top w:val="single" w:sz="4" w:space="0" w:color="000000"/>
+              <w:left w:val="single" w:sz="4" w:space="0" w:color="000000"/>
+              <w:bottom w:val="single" w:sz="4" w:space="0" w:color="000000"/>
+              <w:right w:val="single" w:sz="4" w:space="0" w:color="000000"/>
+            </w:tcBorders>
+          </w:tcPr>
+          <w:p>
+            <w:pPr>
+              <w:spacing w:after="0" w:line="360" w:lineRule="auto"/>
+              <w:ind w:left="0" w:firstLine="0"/>
+              <w:jc w:val="center"/>
+              <w:rPr>
+                <w:b/>
+              </w:rPr>
+            </w:pPr>
+          </w:p>
+          <w:p>
+            <w:pPr>
+              <w:spacing w:after="0" w:line="360" w:lineRule="auto"/>
+              <w:ind w:left="0" w:firstLine="0"/>
+              <w:jc w:val="center"/>
+            </w:pPr>
+            <w:r>
+              <w:rPr>
+                <w:b/>
+              </w:rPr>
+              <w:t>CONDITIONS FOR DIAGNOSIS</w:t>
+            </w:r>
+          </w:p>
+        </w:tc>
+        <w:tc>
+          <w:tcPr>
+            <w:tcW w:w="2835" w:type="dxa"/>
+            <w:tcBorders>
+              <w:top w:val="single" w:sz="4" w:space="0" w:color="000000"/>
+              <w:left w:val="single" w:sz="4" w:space="0" w:color="000000"/>
+              <w:bottom w:val="single" w:sz="4" w:space="0" w:color="000000"/>
+              <w:right w:val="single" w:sz="4" w:space="0" w:color="000000"/>
+            </w:tcBorders>
+            <w:vAlign w:val="center"/>
+          </w:tcPr>
+          <w:p>
+            <w:pPr>
+              <w:spacing w:after="238" w:line="360" w:lineRule="auto"/>
+              <w:ind w:left="0" w:firstLine="0"/>
+              <w:jc w:val="center"/>
+            </w:pPr>
+            <w:r>
+              <w:rPr>
+                <w:b/>
+              </w:rPr>
+              <w:t>CONFIDENCE</w:t>
+            </w:r>
+          </w:p>
+          <w:p>
+            <w:pPr>
+              <w:spacing w:after="0" w:line="360" w:lineRule="auto"/>
+              <w:ind w:left="0" w:firstLine="0"/>
+              <w:jc w:val="center"/>
+            </w:pPr>
+            <w:r>
+              <w:rPr>
+                <w:b/>
+              </w:rPr>
+              <w:t>SCORE</w:t>
+            </w:r>
+          </w:p>
+        </w:tc>
+      </w:tr>
+      <w:tr>
+        <w:trPr>
+          <w:trHeight w:val="691"/>
+        </w:trPr>
+        <w:tc>
+          <w:tcPr>
+            <w:tcW w:w="2127" w:type="dxa"/>
+            <w:tcBorders>
+              <w:top w:val="single" w:sz="4" w:space="0" w:color="000000"/>
+              <w:left w:val="single" w:sz="4" w:space="0" w:color="000000"/>
+              <w:bottom w:val="single" w:sz="4" w:space="0" w:color="000000"/>
+              <w:right w:val="single" w:sz="4" w:space="0" w:color="000000"/>
+            </w:tcBorders>
+            <w:vAlign w:val="center"/>
+          </w:tcPr>
+          <w:p>
+            <w:pPr>
+              <w:spacing w:after="0" w:line="360" w:lineRule="auto"/>
+              <w:ind w:left="0" w:firstLine="0"/>
+              <w:jc w:val="center"/>
+            </w:pPr>
+            <w:r>
+              <w:rPr>
+                <w:b/>
+              </w:rPr>
+              <w:t>1.</w:t>
+            </w:r>
+          </w:p>
+        </w:tc>
+        <w:tc>
+          <w:tcPr>
+            <w:tcW w:w="5528" w:type="dxa"/>
+            <w:tcBorders>
+              <w:top w:val="single" w:sz="4" w:space="0" w:color="000000"/>
+              <w:left w:val="single" w:sz="4" w:space="0" w:color="000000"/>
+              <w:bottom w:val="single" w:sz="4" w:space="0" w:color="000000"/>
+              <w:right w:val="single" w:sz="4" w:space="0" w:color="000000"/>
+            </w:tcBorders>
+            <w:vAlign w:val="center"/>
+          </w:tcPr>
+          <w:p>
+            <w:pPr>
+              <w:spacing w:after="0" w:line="360" w:lineRule="auto"/>
+              <w:ind w:left="0" w:firstLine="0"/>
+              <w:jc w:val="center"/>
+            </w:pPr>
+            <w:r>
+              <w:t>airplane_mode_enabled</w:t>
+            </w:r>
+          </w:p>
+        </w:tc>
+        <w:tc>
+          <w:tcPr>
+            <w:tcW w:w="2835" w:type="dxa"/>
+            <w:tcBorders>
+              <w:top w:val="single" w:sz="4" w:space="0" w:color="000000"/>
+              <w:left w:val="single" w:sz="4" w:space="0" w:color="000000"/>
+              <w:bottom w:val="single" w:sz="4" w:space="0" w:color="000000"/>
+              <w:right w:val="single" w:sz="4" w:space="0" w:color="000000"/>
+            </w:tcBorders>
+            <w:vAlign w:val="center"/>
+          </w:tcPr>
+          <w:p>
+            <w:pPr>
+              <w:spacing w:after="0" w:line="360" w:lineRule="auto"/>
+              <w:ind w:left="0" w:firstLine="0"/>
+              <w:jc w:val="center"/>
+            </w:pPr>
+            <w:r>
+              <w:rPr>
+                <w:b/>
+              </w:rPr>
+              <w:t>95</w:t>
+            </w:r>
+          </w:p>
+        </w:tc>
+      </w:tr>
+      <w:tr>
+        <w:trPr>
+          <w:trHeight w:val="395"/>
+        </w:trPr>
+        <w:tc>
+          <w:tcPr>
+            <w:tcW w:w="2127" w:type="dxa"/>
+            <w:tcBorders>
+              <w:top w:val="single" w:sz="4" w:space="0" w:color="000000"/>
+              <w:left w:val="single" w:sz="4" w:space="0" w:color="000000"/>
+              <w:bottom w:val="single" w:sz="4" w:space="0" w:color="000000"/>
+              <w:right w:val="single" w:sz="4" w:space="0" w:color="000000"/>
+            </w:tcBorders>
+            <w:vAlign w:val="center"/>
+          </w:tcPr>
+          <w:p>
+            <w:pPr>
+              <w:spacing w:after="0" w:line="360" w:lineRule="auto"/>
+              <w:ind w:left="0" w:firstLine="0"/>
+              <w:jc w:val="center"/>
+            </w:pPr>
+            <w:r>
+              <w:rPr>
+                <w:b/>
+              </w:rPr>
+              <w:t>2.</w:t>
+            </w:r>
+          </w:p>
+        </w:tc>
+        <w:tc>
+          <w:tcPr>
+            <w:tcW w:w="5528" w:type="dxa"/>
+            <w:tcBorders>
+              <w:top w:val="single" w:sz="4" w:space="0" w:color="000000"/>
+              <w:left w:val="single" w:sz="4" w:space="0" w:color="000000"/>
+              <w:bottom w:val="single" w:sz="4" w:space="0" w:color="000000"/>
+              <w:right w:val="single" w:sz="4" w:space="0" w:color="000000"/>
+            </w:tcBorders>
+            <w:vAlign w:val="center"/>
+          </w:tcPr>
+          <w:p>
+            <w:pPr>
+              <w:spacing w:after="0" w:line="360" w:lineRule="auto"/>
+              <w:ind w:left="0" w:firstLine="0"/>
+              <w:jc w:val="center"/>
+            </w:pPr>
+            <w:r>
+              <w:t>wifi_disabled</w:t>
+            </w:r>
+          </w:p>
+        </w:tc>
+        <w:tc>
+          <w:tcPr>
+            <w:tcW w:w="2835" w:type="dxa"/>
+            <w:tcBorders>
+              <w:top w:val="single" w:sz="4" w:space="0" w:color="000000"/>
+              <w:left w:val="single" w:sz="4" w:space="0" w:color="000000"/>
+              <w:bottom w:val="single" w:sz="4" w:space="0" w:color="000000"/>
+              <w:right w:val="single" w:sz="4" w:space="0" w:color="000000"/>
+            </w:tcBorders>
+            <w:vAlign w:val="center"/>
+          </w:tcPr>
+          <w:p>
+            <w:pPr>
+              <w:spacing w:after="0" w:line="360" w:lineRule="auto"/>
+              <w:ind w:left="0" w:firstLine="0"/>
+              <w:jc w:val="center"/>
+            </w:pPr>
+            <w:r>
+              <w:rPr>
+                <w:b/>
+              </w:rPr>
+              <w:t>90</w:t>
+            </w:r>
+          </w:p>
+        </w:tc>
+      </w:tr>
+      <w:tr>
+        <w:trPr>
+          <w:trHeight w:val="416"/>
+        </w:trPr>
+        <w:tc>
+          <w:tcPr>
+            <w:tcW w:w="2127" w:type="dxa"/>
+            <w:tcBorders>
+              <w:top w:val="single" w:sz="4" w:space="0" w:color="000000"/>
+              <w:left w:val="single" w:sz="4" w:space="0" w:color="000000"/>
+              <w:bottom w:val="single" w:sz="4" w:space="0" w:color="000000"/>
+              <w:right w:val="single" w:sz="4" w:space="0" w:color="000000"/>
+            </w:tcBorders>
+            <w:vAlign w:val="center"/>
+          </w:tcPr>
+          <w:p>
+            <w:pPr>
+              <w:spacing w:after="0" w:line="360" w:lineRule="auto"/>
+              <w:ind w:left="0" w:firstLine="0"/>
+              <w:jc w:val="center"/>
+            </w:pPr>
+            <w:r>
+              <w:rPr>
+                <w:b/>
+              </w:rPr>
+              <w:t>3.</w:t>
+            </w:r>
+          </w:p>
+        </w:tc>
+        <w:tc>
+          <w:tcPr>
+            <w:tcW w:w="5528" w:type="dxa"/>
+            <w:tcBorders>
+              <w:top w:val="single" w:sz="4" w:space="0" w:color="000000"/>
+              <w:left w:val="single" w:sz="4" w:space="0" w:color="000000"/>
+              <w:bottom w:val="single" w:sz="4" w:space="0" w:color="000000"/>
+              <w:right w:val="single" w:sz="4" w:space="0" w:color="000000"/>
+            </w:tcBorders>
+            <w:vAlign w:val="center"/>
+          </w:tcPr>
+          <w:p>
+            <w:pPr>
+              <w:spacing w:after="0" w:line="360" w:lineRule="auto"/>
+              <w:ind w:left="0" w:firstLine="0"/>
+              <w:jc w:val="center"/>
+            </w:pPr>
+            <w:r>
+              <w:t>adapter_or_driver_issue</w:t>
+            </w:r>
+          </w:p>
+        </w:tc>
+        <w:tc>
+          <w:tcPr>
+            <w:tcW w:w="2835" w:type="dxa"/>
+            <w:tcBorders>
+              <w:top w:val="single" w:sz="4" w:space="0" w:color="000000"/>
+              <w:left w:val="single" w:sz="4" w:space="0" w:color="000000"/>
+              <w:bottom w:val="single" w:sz="4" w:space="0" w:color="000000"/>
+              <w:right w:val="single" w:sz="4" w:space="0" w:color="000000"/>
+            </w:tcBorders>
+            <w:vAlign w:val="center"/>
+          </w:tcPr>
+          <w:p>
+            <w:pPr>
+              <w:spacing w:after="0" w:line="360" w:lineRule="auto"/>
+              <w:ind w:left="0" w:firstLine="0"/>
+              <w:jc w:val="center"/>
+            </w:pPr>
+            <w:r>
+              <w:rPr>
+                <w:b/>
+              </w:rPr>
+              <w:t>80</w:t>
+            </w:r>
+          </w:p>
+        </w:tc>
+      </w:tr>
+      <w:tr>
+        <w:trPr>
+          <w:trHeight w:val="691"/>
+        </w:trPr>
+        <w:tc>
+          <w:tcPr>
+            <w:tcW w:w="2127" w:type="dxa"/>
+            <w:tcBorders>
+              <w:top w:val="single" w:sz="4" w:space="0" w:color="000000"/>
+              <w:left w:val="single" w:sz="4" w:space="0" w:color="000000"/>
+              <w:bottom w:val="single" w:sz="4" w:space="0" w:color="000000"/>
+              <w:right w:val="single" w:sz="4" w:space="0" w:color="000000"/>
+            </w:tcBorders>
+            <w:vAlign w:val="center"/>
+          </w:tcPr>
+          <w:p>
+            <w:pPr>
+              <w:spacing w:after="0" w:line="360" w:lineRule="auto"/>
+              <w:ind w:left="0" w:firstLine="0"/>
+              <w:jc w:val="center"/>
+            </w:pPr>
+            <w:r>
+              <w:rPr>
+                <w:b/>
+              </w:rPr>
+              <w:lastRenderedPageBreak/>
+              <w:t>4.</w:t>
+            </w:r>
+          </w:p>
+        </w:tc>
+        <w:tc>
+          <w:tcPr>
+            <w:tcW w:w="5528" w:type="dxa"/>
+            <w:tcBorders>
+              <w:top w:val="single" w:sz="4" w:space="0" w:color="000000"/>
+              <w:left w:val="single" w:sz="4" w:space="0" w:color="000000"/>
+              <w:bottom w:val="single" w:sz="4" w:space="0" w:color="000000"/>
+              <w:right w:val="single" w:sz="4" w:space="0" w:color="000000"/>
+            </w:tcBorders>
+            <w:vAlign w:val="center"/>
+          </w:tcPr>
+          <w:p>
+            <w:pPr>
+              <w:spacing w:after="0" w:line="360" w:lineRule="auto"/>
+              <w:ind w:left="0" w:firstLine="0"/>
+              <w:jc w:val="center"/>
+            </w:pPr>
+            <w:r>
+              <w:t>password_or_profile_issue</w:t>
+            </w:r>
+          </w:p>
+        </w:tc>
+        <w:tc>
+          <w:tcPr>
+            <w:tcW w:w="2835" w:type="dxa"/>
+            <w:tcBorders>
+              <w:top w:val="single" w:sz="4" w:space="0" w:color="000000"/>
+              <w:left w:val="single" w:sz="4" w:space="0" w:color="000000"/>
+              <w:bottom w:val="single" w:sz="4" w:space="0" w:color="000000"/>
+              <w:right w:val="single" w:sz="4" w:space="0" w:color="000000"/>
+            </w:tcBorders>
+            <w:vAlign w:val="center"/>
+          </w:tcPr>
+          <w:p>
+            <w:pPr>
+              <w:spacing w:after="0" w:line="360" w:lineRule="auto"/>
+              <w:ind w:left="0" w:firstLine="0"/>
+              <w:jc w:val="center"/>
+            </w:pPr>
+            <w:r>
+              <w:rPr>
+                <w:b/>
+              </w:rPr>
+              <w:t>85</w:t>
+            </w:r>
+          </w:p>
+        </w:tc>
+      </w:tr>
+      <w:tr>
+        <w:trPr>
+          <w:trHeight w:val="691"/>
+        </w:trPr>
+        <w:tc>
+          <w:tcPr>
+            <w:tcW w:w="2127" w:type="dxa"/>
+            <w:tcBorders>
+              <w:top w:val="single" w:sz="4" w:space="0" w:color="000000"/>
+              <w:left w:val="single" w:sz="4" w:space="0" w:color="000000"/>
+              <w:bottom w:val="single" w:sz="4" w:space="0" w:color="000000"/>
+              <w:right w:val="single" w:sz="4" w:space="0" w:color="000000"/>
+            </w:tcBorders>
+            <w:vAlign w:val="center"/>
+          </w:tcPr>
+          <w:p>
+            <w:pPr>
+              <w:spacing w:after="0" w:line="360" w:lineRule="auto"/>
+              <w:ind w:left="0" w:firstLine="0"/>
+              <w:jc w:val="center"/>
+            </w:pPr>
+            <w:r>
+              <w:rPr>
+                <w:b/>
+              </w:rPr>
+              <w:t>5.</w:t>
+            </w:r>
+          </w:p>
+        </w:tc>
+        <w:tc>
+          <w:tcPr>
+            <w:tcW w:w="5528" w:type="dxa"/>
+            <w:tcBorders>
+              <w:top w:val="single" w:sz="4" w:space="0" w:color="000000"/>
+              <w:left w:val="single" w:sz="4" w:space="0" w:color="000000"/>
+              <w:bottom w:val="single" w:sz="4" w:space="0" w:color="000000"/>
+              <w:right w:val="single" w:sz="4" w:space="0" w:color="000000"/>
+            </w:tcBorders>
+            <w:vAlign w:val="center"/>
+          </w:tcPr>
+          <w:p>
+            <w:pPr>
+              <w:spacing w:after="0" w:line="360" w:lineRule="auto"/>
+              <w:ind w:left="0" w:firstLine="0"/>
+              <w:jc w:val="center"/>
+            </w:pPr>
+            <w:r>
+              <w:t>dns_or_ip_stack_issue</w:t>
+            </w:r>
+          </w:p>
+        </w:tc>
+        <w:tc>
+          <w:tcPr>
+            <w:tcW w:w="2835" w:type="dxa"/>
+            <w:tcBorders>
+              <w:top w:val="single" w:sz="4" w:space="0" w:color="000000"/>
+              <w:left w:val="single" w:sz="4" w:space="0" w:color="000000"/>
+              <w:bottom w:val="single" w:sz="4" w:space="0" w:color="000000"/>
+              <w:right w:val="single" w:sz="4" w:space="0" w:color="000000"/>
+            </w:tcBorders>
+            <w:vAlign w:val="center"/>
+          </w:tcPr>
+          <w:p>
+            <w:pPr>
+              <w:spacing w:after="0" w:line="360" w:lineRule="auto"/>
+              <w:ind w:left="0" w:firstLine="0"/>
+              <w:jc w:val="center"/>
+            </w:pPr>
+            <w:r>
+              <w:rPr>
+                <w:b/>
+              </w:rPr>
+              <w:t>80</w:t>
+            </w:r>
+          </w:p>
+        </w:tc>
+      </w:tr>
+      <w:tr>
+        <w:trPr>
+          <w:trHeight w:val="693"/>
+        </w:trPr>
+        <w:tc>
+          <w:tcPr>
+            <w:tcW w:w="2127" w:type="dxa"/>
+            <w:tcBorders>
+              <w:top w:val="single" w:sz="4" w:space="0" w:color="000000"/>
+              <w:left w:val="single" w:sz="4" w:space="0" w:color="000000"/>
+              <w:bottom w:val="single" w:sz="4" w:space="0" w:color="000000"/>
+              <w:right w:val="single" w:sz="4" w:space="0" w:color="000000"/>
+            </w:tcBorders>
+            <w:vAlign w:val="center"/>
+          </w:tcPr>
+          <w:p>
+            <w:pPr>
+              <w:spacing w:after="0" w:line="360" w:lineRule="auto"/>
+              <w:ind w:left="0" w:firstLine="0"/>
+              <w:jc w:val="center"/>
+            </w:pPr>
+            <w:r>
+              <w:rPr>
+                <w:b/>
+              </w:rPr>
+              <w:t>6.</w:t>
+            </w:r>
+          </w:p>
+        </w:tc>
+        <w:tc>
+          <w:tcPr>
+            <w:tcW w:w="5528" w:type="dxa"/>
+            <w:tcBorders>
+              <w:top w:val="single" w:sz="4" w:space="0" w:color="000000"/>
+              <w:left w:val="single" w:sz="4" w:space="0" w:color="000000"/>
+              <w:bottom w:val="single" w:sz="4" w:space="0" w:color="000000"/>
+              <w:right w:val="single" w:sz="4" w:space="0" w:color="000000"/>
+            </w:tcBorders>
+            <w:vAlign w:val="center"/>
+          </w:tcPr>
+          <w:p>
+            <w:pPr>
+              <w:spacing w:after="0" w:line="360" w:lineRule="auto"/>
+              <w:ind w:left="0" w:firstLine="0"/>
+              <w:jc w:val="center"/>
+            </w:pPr>
+            <w:r>
+              <w:t>router_or_isp_problem</w:t>
+            </w:r>
+          </w:p>
+        </w:tc>
+        <w:tc>
+          <w:tcPr>
+            <w:tcW w:w="2835" w:type="dxa"/>
+            <w:tcBorders>
+              <w:top w:val="single" w:sz="4" w:space="0" w:color="000000"/>
+              <w:left w:val="single" w:sz="4" w:space="0" w:color="000000"/>
+              <w:bottom w:val="single" w:sz="4" w:space="0" w:color="000000"/>
+              <w:right w:val="single" w:sz="4" w:space="0" w:color="000000"/>
+            </w:tcBorders>
+            <w:vAlign w:val="center"/>
+          </w:tcPr>
+          <w:p>
+            <w:pPr>
+              <w:spacing w:after="0" w:line="360" w:lineRule="auto"/>
+              <w:ind w:left="0" w:firstLine="0"/>
+              <w:jc w:val="center"/>
+            </w:pPr>
+            <w:r>
+              <w:rPr>
+                <w:b/>
+              </w:rPr>
+              <w:t>75</w:t>
+            </w:r>
+          </w:p>
+        </w:tc>
+      </w:tr>
+    </w:tbl>
+    <w:p>
+      <w:pPr>
+        <w:spacing w:line="480" w:lineRule="auto"/>
+        <w:rPr>
+          <w:lang w:val="en-US"/>
+        </w:rPr>
+      </w:pPr>
     </w:p>
     <w:sectPr>
       <w:footerReference w:type="default" r:id="rId8"/>

</xml_diff>

<commit_message>
docs: add symptom questions used by the diagnostic consultation process (auth:imquaye)
</commit_message>
<xml_diff>
--- a/docs/KE DELIVERABLE.docx
+++ b/docs/KE DELIVERABLE.docx
@@ -403,6 +403,9 @@
       <w:pPr>
         <w:spacing w:after="291" w:line="360" w:lineRule="auto"/>
         <w:ind w:left="365" w:firstLine="0"/>
+        <w:rPr>
+          <w:lang w:val="en-US"/>
+        </w:rPr>
       </w:pPr>
       <w:r>
         <w:t>The names assigned to conditions remain constant throughout the diagnosis process to maintain consistency within the knowledge base. Each condition is associated with a confidence score that represents the degree of certainty about the relationship between the observed symptoms and the possible diagnosis. In this system, the confidence scores are assigned based on the judgement and experience of domain experts, who estimate how strongly certain symptoms indicate certain conditions. These values serve as a measure of belief in the rules defined within the system. Although the scores are initially determined through expert knowledge rather than strict mathematical computation, they may be reviewed and adjusted over time as new knowledge about the domain becomes available or as improvements are made to the system.</w:t>
@@ -411,31 +414,10 @@
     <w:p>
       <w:pPr>
         <w:spacing w:after="291" w:line="360" w:lineRule="auto"/>
-        <w:ind w:left="365" w:firstLine="0"/>
-      </w:pPr>
-    </w:p>
-    <w:p>
-      <w:pPr>
-        <w:spacing w:after="291" w:line="360" w:lineRule="auto"/>
-        <w:ind w:left="365" w:firstLine="0"/>
-      </w:pPr>
-    </w:p>
-    <w:p>
-      <w:pPr>
-        <w:spacing w:after="291" w:line="360" w:lineRule="auto"/>
-        <w:ind w:left="365" w:firstLine="0"/>
-      </w:pPr>
-    </w:p>
-    <w:p>
-      <w:pPr>
-        <w:spacing w:after="291" w:line="360" w:lineRule="auto"/>
-        <w:ind w:left="365" w:firstLine="0"/>
-      </w:pPr>
-    </w:p>
-    <w:p>
-      <w:pPr>
-        <w:spacing w:after="291" w:line="360" w:lineRule="auto"/>
-        <w:ind w:left="365" w:firstLine="0"/>
+        <w:ind w:left="0" w:firstLine="0"/>
+        <w:rPr>
+          <w:lang w:val="en-US"/>
+        </w:rPr>
       </w:pPr>
     </w:p>
     <w:tbl>
@@ -811,7 +793,6 @@
               <w:rPr>
                 <w:b/>
               </w:rPr>
-              <w:lastRenderedPageBreak/>
               <w:t>4.</w:t>
             </w:r>
           </w:p>
@@ -1022,6 +1003,501 @@
     <w:p>
       <w:pPr>
         <w:spacing w:line="480" w:lineRule="auto"/>
+        <w:rPr>
+          <w:lang w:val="en-US"/>
+        </w:rPr>
+      </w:pPr>
+    </w:p>
+    <w:p>
+      <w:pPr>
+        <w:pStyle w:val="Heading2"/>
+        <w:spacing w:line="360" w:lineRule="auto"/>
+        <w:ind w:left="0" w:firstLine="0"/>
+        <w:rPr>
+          <w:rFonts w:ascii="Times New Roman" w:hAnsi="Times New Roman" w:cs="Times New Roman"/>
+          <w:b/>
+          <w:sz w:val="32"/>
+          <w:szCs w:val="32"/>
+          <w:lang w:val="en-US"/>
+        </w:rPr>
+      </w:pPr>
+      <w:bookmarkStart w:id="3" w:name="_Toc223968944"/>
+      <w:r>
+        <w:rPr>
+          <w:rFonts w:ascii="Times New Roman" w:hAnsi="Times New Roman" w:cs="Times New Roman"/>
+          <w:b/>
+          <w:sz w:val="32"/>
+          <w:szCs w:val="32"/>
+          <w:lang w:val="en-US"/>
+        </w:rPr>
+        <w:t>SYMPTOMS / FACTS (8 QUESTIONS MAX)</w:t>
+      </w:r>
+      <w:bookmarkEnd w:id="3"/>
+    </w:p>
+    <w:p>
+      <w:pPr>
+        <w:spacing w:after="294" w:line="360" w:lineRule="auto"/>
+        <w:ind w:left="10" w:firstLine="710"/>
+      </w:pPr>
+      <w:r>
+        <w:t xml:space="preserve">Accept Yes or No answers only </w:t>
+      </w:r>
+    </w:p>
+    <w:tbl>
+      <w:tblPr>
+        <w:tblStyle w:val="TableGrid"/>
+        <w:tblW w:w="9352" w:type="dxa"/>
+        <w:tblInd w:w="5" w:type="dxa"/>
+        <w:tblCellMar>
+          <w:left w:w="108" w:type="dxa"/>
+          <w:right w:w="115" w:type="dxa"/>
+        </w:tblCellMar>
+        <w:tblLook w:val="04A0" w:firstRow="1" w:lastRow="0" w:firstColumn="1" w:lastColumn="0" w:noHBand="0" w:noVBand="1"/>
+      </w:tblPr>
+      <w:tblGrid>
+        <w:gridCol w:w="4676"/>
+        <w:gridCol w:w="4676"/>
+      </w:tblGrid>
+      <w:tr>
+        <w:trPr>
+          <w:trHeight w:val="768"/>
+        </w:trPr>
+        <w:tc>
+          <w:tcPr>
+            <w:tcW w:w="4676" w:type="dxa"/>
+            <w:tcBorders>
+              <w:top w:val="single" w:sz="4" w:space="0" w:color="000000"/>
+              <w:left w:val="single" w:sz="4" w:space="0" w:color="000000"/>
+              <w:bottom w:val="single" w:sz="4" w:space="0" w:color="000000"/>
+              <w:right w:val="single" w:sz="4" w:space="0" w:color="000000"/>
+            </w:tcBorders>
+            <w:vAlign w:val="center"/>
+          </w:tcPr>
+          <w:p>
+            <w:pPr>
+              <w:spacing w:after="0" w:line="360" w:lineRule="auto"/>
+              <w:ind w:left="0" w:firstLine="0"/>
+            </w:pPr>
+            <w:r>
+              <w:rPr>
+                <w:b/>
+              </w:rPr>
+              <w:t>Fact name</w:t>
+            </w:r>
+            <w:r>
+              <w:t xml:space="preserve"> </w:t>
+            </w:r>
+          </w:p>
+        </w:tc>
+        <w:tc>
+          <w:tcPr>
+            <w:tcW w:w="4676" w:type="dxa"/>
+            <w:tcBorders>
+              <w:top w:val="single" w:sz="4" w:space="0" w:color="000000"/>
+              <w:left w:val="single" w:sz="4" w:space="0" w:color="000000"/>
+              <w:bottom w:val="single" w:sz="4" w:space="0" w:color="000000"/>
+              <w:right w:val="single" w:sz="4" w:space="0" w:color="000000"/>
+            </w:tcBorders>
+            <w:vAlign w:val="center"/>
+          </w:tcPr>
+          <w:p>
+            <w:pPr>
+              <w:spacing w:after="0" w:line="360" w:lineRule="auto"/>
+              <w:ind w:left="0" w:firstLine="0"/>
+            </w:pPr>
+            <w:r>
+              <w:rPr>
+                <w:b/>
+              </w:rPr>
+              <w:t>Question (asked to user)</w:t>
+            </w:r>
+            <w:r>
+              <w:t xml:space="preserve"> </w:t>
+            </w:r>
+          </w:p>
+        </w:tc>
+      </w:tr>
+      <w:tr>
+        <w:trPr>
+          <w:trHeight w:val="766"/>
+        </w:trPr>
+        <w:tc>
+          <w:tcPr>
+            <w:tcW w:w="4676" w:type="dxa"/>
+            <w:tcBorders>
+              <w:top w:val="single" w:sz="4" w:space="0" w:color="000000"/>
+              <w:left w:val="single" w:sz="4" w:space="0" w:color="000000"/>
+              <w:bottom w:val="single" w:sz="4" w:space="0" w:color="000000"/>
+              <w:right w:val="single" w:sz="4" w:space="0" w:color="000000"/>
+            </w:tcBorders>
+            <w:vAlign w:val="center"/>
+          </w:tcPr>
+          <w:p>
+            <w:pPr>
+              <w:spacing w:after="0" w:line="360" w:lineRule="auto"/>
+              <w:ind w:left="0" w:firstLine="0"/>
+            </w:pPr>
+            <w:r>
+              <w:t xml:space="preserve">airplane_mode </w:t>
+            </w:r>
+          </w:p>
+        </w:tc>
+        <w:tc>
+          <w:tcPr>
+            <w:tcW w:w="4676" w:type="dxa"/>
+            <w:tcBorders>
+              <w:top w:val="single" w:sz="4" w:space="0" w:color="000000"/>
+              <w:left w:val="single" w:sz="4" w:space="0" w:color="000000"/>
+              <w:bottom w:val="single" w:sz="4" w:space="0" w:color="000000"/>
+              <w:right w:val="single" w:sz="4" w:space="0" w:color="000000"/>
+            </w:tcBorders>
+            <w:vAlign w:val="center"/>
+          </w:tcPr>
+          <w:p>
+            <w:pPr>
+              <w:spacing w:after="0" w:line="360" w:lineRule="auto"/>
+              <w:ind w:left="0" w:firstLine="0"/>
+            </w:pPr>
+            <w:r>
+              <w:t xml:space="preserve">Is Airplane Mode ON? </w:t>
+            </w:r>
+          </w:p>
+        </w:tc>
+      </w:tr>
+      <w:tr>
+        <w:trPr>
+          <w:trHeight w:val="766"/>
+        </w:trPr>
+        <w:tc>
+          <w:tcPr>
+            <w:tcW w:w="4676" w:type="dxa"/>
+            <w:tcBorders>
+              <w:top w:val="single" w:sz="4" w:space="0" w:color="000000"/>
+              <w:left w:val="single" w:sz="4" w:space="0" w:color="000000"/>
+              <w:bottom w:val="single" w:sz="4" w:space="0" w:color="000000"/>
+              <w:right w:val="single" w:sz="4" w:space="0" w:color="000000"/>
+            </w:tcBorders>
+            <w:vAlign w:val="center"/>
+          </w:tcPr>
+          <w:p>
+            <w:pPr>
+              <w:spacing w:after="0" w:line="360" w:lineRule="auto"/>
+              <w:ind w:left="0" w:firstLine="0"/>
+            </w:pPr>
+            <w:r>
+              <w:t xml:space="preserve">wifi_enabled </w:t>
+            </w:r>
+          </w:p>
+        </w:tc>
+        <w:tc>
+          <w:tcPr>
+            <w:tcW w:w="4676" w:type="dxa"/>
+            <w:tcBorders>
+              <w:top w:val="single" w:sz="4" w:space="0" w:color="000000"/>
+              <w:left w:val="single" w:sz="4" w:space="0" w:color="000000"/>
+              <w:bottom w:val="single" w:sz="4" w:space="0" w:color="000000"/>
+              <w:right w:val="single" w:sz="4" w:space="0" w:color="000000"/>
+            </w:tcBorders>
+            <w:vAlign w:val="center"/>
+          </w:tcPr>
+          <w:p>
+            <w:pPr>
+              <w:spacing w:after="0" w:line="360" w:lineRule="auto"/>
+              <w:ind w:left="0" w:firstLine="0"/>
+            </w:pPr>
+            <w:r>
+              <w:t xml:space="preserve">Is Wi-Fi enabled on the laptop? </w:t>
+            </w:r>
+          </w:p>
+        </w:tc>
+      </w:tr>
+      <w:tr>
+        <w:trPr>
+          <w:trHeight w:val="766"/>
+        </w:trPr>
+        <w:tc>
+          <w:tcPr>
+            <w:tcW w:w="4676" w:type="dxa"/>
+            <w:tcBorders>
+              <w:top w:val="single" w:sz="4" w:space="0" w:color="000000"/>
+              <w:left w:val="single" w:sz="4" w:space="0" w:color="000000"/>
+              <w:bottom w:val="single" w:sz="4" w:space="0" w:color="000000"/>
+              <w:right w:val="single" w:sz="4" w:space="0" w:color="000000"/>
+            </w:tcBorders>
+            <w:vAlign w:val="center"/>
+          </w:tcPr>
+          <w:p>
+            <w:pPr>
+              <w:spacing w:after="0" w:line="360" w:lineRule="auto"/>
+              <w:ind w:left="0" w:firstLine="0"/>
+            </w:pPr>
+            <w:r>
+              <w:t xml:space="preserve">sees_networks </w:t>
+            </w:r>
+          </w:p>
+        </w:tc>
+        <w:tc>
+          <w:tcPr>
+            <w:tcW w:w="4676" w:type="dxa"/>
+            <w:tcBorders>
+              <w:top w:val="single" w:sz="4" w:space="0" w:color="000000"/>
+              <w:left w:val="single" w:sz="4" w:space="0" w:color="000000"/>
+              <w:bottom w:val="single" w:sz="4" w:space="0" w:color="000000"/>
+              <w:right w:val="single" w:sz="4" w:space="0" w:color="000000"/>
+            </w:tcBorders>
+            <w:vAlign w:val="center"/>
+          </w:tcPr>
+          <w:p>
+            <w:pPr>
+              <w:spacing w:after="0" w:line="360" w:lineRule="auto"/>
+              <w:ind w:left="0" w:firstLine="0"/>
+            </w:pPr>
+            <w:r>
+              <w:t xml:space="preserve">Can the laptop see Wi-Fi networks? </w:t>
+            </w:r>
+          </w:p>
+        </w:tc>
+      </w:tr>
+      <w:tr>
+        <w:trPr>
+          <w:trHeight w:val="766"/>
+        </w:trPr>
+        <w:tc>
+          <w:tcPr>
+            <w:tcW w:w="4676" w:type="dxa"/>
+            <w:tcBorders>
+              <w:top w:val="single" w:sz="4" w:space="0" w:color="000000"/>
+              <w:left w:val="single" w:sz="4" w:space="0" w:color="000000"/>
+              <w:bottom w:val="single" w:sz="4" w:space="0" w:color="000000"/>
+              <w:right w:val="single" w:sz="4" w:space="0" w:color="000000"/>
+            </w:tcBorders>
+            <w:vAlign w:val="center"/>
+          </w:tcPr>
+          <w:p>
+            <w:pPr>
+              <w:spacing w:after="0" w:line="360" w:lineRule="auto"/>
+              <w:ind w:left="0" w:firstLine="0"/>
+            </w:pPr>
+            <w:r>
+              <w:t xml:space="preserve">can_connect </w:t>
+            </w:r>
+          </w:p>
+        </w:tc>
+        <w:tc>
+          <w:tcPr>
+            <w:tcW w:w="4676" w:type="dxa"/>
+            <w:tcBorders>
+              <w:top w:val="single" w:sz="4" w:space="0" w:color="000000"/>
+              <w:left w:val="single" w:sz="4" w:space="0" w:color="000000"/>
+              <w:bottom w:val="single" w:sz="4" w:space="0" w:color="000000"/>
+              <w:right w:val="single" w:sz="4" w:space="0" w:color="000000"/>
+            </w:tcBorders>
+            <w:vAlign w:val="center"/>
+          </w:tcPr>
+          <w:p>
+            <w:pPr>
+              <w:spacing w:after="0" w:line="360" w:lineRule="auto"/>
+              <w:ind w:left="0" w:firstLine="0"/>
+            </w:pPr>
+            <w:r>
+              <w:t xml:space="preserve">Can it connect to the Wi-Fi network? </w:t>
+            </w:r>
+          </w:p>
+        </w:tc>
+      </w:tr>
+      <w:tr>
+        <w:trPr>
+          <w:trHeight w:val="768"/>
+        </w:trPr>
+        <w:tc>
+          <w:tcPr>
+            <w:tcW w:w="4676" w:type="dxa"/>
+            <w:tcBorders>
+              <w:top w:val="single" w:sz="4" w:space="0" w:color="000000"/>
+              <w:left w:val="single" w:sz="4" w:space="0" w:color="000000"/>
+              <w:bottom w:val="single" w:sz="4" w:space="0" w:color="000000"/>
+              <w:right w:val="single" w:sz="4" w:space="0" w:color="000000"/>
+            </w:tcBorders>
+            <w:vAlign w:val="center"/>
+          </w:tcPr>
+          <w:p>
+            <w:pPr>
+              <w:spacing w:after="0" w:line="360" w:lineRule="auto"/>
+              <w:ind w:left="0" w:firstLine="0"/>
+            </w:pPr>
+            <w:r>
+              <w:t xml:space="preserve">connected_to_wifi </w:t>
+            </w:r>
+          </w:p>
+        </w:tc>
+        <w:tc>
+          <w:tcPr>
+            <w:tcW w:w="4676" w:type="dxa"/>
+            <w:tcBorders>
+              <w:top w:val="single" w:sz="4" w:space="0" w:color="000000"/>
+              <w:left w:val="single" w:sz="4" w:space="0" w:color="000000"/>
+              <w:bottom w:val="single" w:sz="4" w:space="0" w:color="000000"/>
+              <w:right w:val="single" w:sz="4" w:space="0" w:color="000000"/>
+            </w:tcBorders>
+            <w:vAlign w:val="center"/>
+          </w:tcPr>
+          <w:p>
+            <w:pPr>
+              <w:spacing w:after="0" w:line="360" w:lineRule="auto"/>
+              <w:ind w:left="0" w:firstLine="0"/>
+            </w:pPr>
+            <w:r>
+              <w:t xml:space="preserve">Does it show connected to Wi-Fi? </w:t>
+            </w:r>
+          </w:p>
+        </w:tc>
+      </w:tr>
+      <w:tr>
+        <w:trPr>
+          <w:trHeight w:val="766"/>
+        </w:trPr>
+        <w:tc>
+          <w:tcPr>
+            <w:tcW w:w="4676" w:type="dxa"/>
+            <w:tcBorders>
+              <w:top w:val="single" w:sz="4" w:space="0" w:color="000000"/>
+              <w:left w:val="single" w:sz="4" w:space="0" w:color="000000"/>
+              <w:bottom w:val="single" w:sz="4" w:space="0" w:color="000000"/>
+              <w:right w:val="single" w:sz="4" w:space="0" w:color="000000"/>
+            </w:tcBorders>
+            <w:vAlign w:val="center"/>
+          </w:tcPr>
+          <w:p>
+            <w:pPr>
+              <w:spacing w:after="0" w:line="360" w:lineRule="auto"/>
+              <w:ind w:left="0" w:firstLine="0"/>
+            </w:pPr>
+            <w:r>
+              <w:t xml:space="preserve">internet_access </w:t>
+            </w:r>
+          </w:p>
+        </w:tc>
+        <w:tc>
+          <w:tcPr>
+            <w:tcW w:w="4676" w:type="dxa"/>
+            <w:tcBorders>
+              <w:top w:val="single" w:sz="4" w:space="0" w:color="000000"/>
+              <w:left w:val="single" w:sz="4" w:space="0" w:color="000000"/>
+              <w:bottom w:val="single" w:sz="4" w:space="0" w:color="000000"/>
+              <w:right w:val="single" w:sz="4" w:space="0" w:color="000000"/>
+            </w:tcBorders>
+            <w:vAlign w:val="center"/>
+          </w:tcPr>
+          <w:p>
+            <w:pPr>
+              <w:spacing w:after="0" w:line="360" w:lineRule="auto"/>
+              <w:ind w:left="0" w:firstLine="0"/>
+            </w:pPr>
+            <w:r>
+              <w:t xml:space="preserve">Does the internet work on the laptop? </w:t>
+            </w:r>
+          </w:p>
+        </w:tc>
+      </w:tr>
+      <w:tr>
+        <w:trPr>
+          <w:trHeight w:val="766"/>
+        </w:trPr>
+        <w:tc>
+          <w:tcPr>
+            <w:tcW w:w="4676" w:type="dxa"/>
+            <w:tcBorders>
+              <w:top w:val="single" w:sz="4" w:space="0" w:color="000000"/>
+              <w:left w:val="single" w:sz="4" w:space="0" w:color="000000"/>
+              <w:bottom w:val="single" w:sz="4" w:space="0" w:color="000000"/>
+              <w:right w:val="single" w:sz="4" w:space="0" w:color="000000"/>
+            </w:tcBorders>
+            <w:vAlign w:val="center"/>
+          </w:tcPr>
+          <w:p>
+            <w:pPr>
+              <w:spacing w:after="0" w:line="360" w:lineRule="auto"/>
+              <w:ind w:left="0" w:firstLine="0"/>
+            </w:pPr>
+            <w:r>
+              <w:t xml:space="preserve">other_devices_connect </w:t>
+            </w:r>
+          </w:p>
+        </w:tc>
+        <w:tc>
+          <w:tcPr>
+            <w:tcW w:w="4676" w:type="dxa"/>
+            <w:tcBorders>
+              <w:top w:val="single" w:sz="4" w:space="0" w:color="000000"/>
+              <w:left w:val="single" w:sz="4" w:space="0" w:color="000000"/>
+              <w:bottom w:val="single" w:sz="4" w:space="0" w:color="000000"/>
+              <w:right w:val="single" w:sz="4" w:space="0" w:color="000000"/>
+            </w:tcBorders>
+            <w:vAlign w:val="center"/>
+          </w:tcPr>
+          <w:p>
+            <w:pPr>
+              <w:spacing w:after="0" w:line="360" w:lineRule="auto"/>
+              <w:ind w:left="0" w:firstLine="0"/>
+            </w:pPr>
+            <w:r>
+              <w:t xml:space="preserve">Do other devices connect to that same Wi-Fi? </w:t>
+            </w:r>
+          </w:p>
+        </w:tc>
+      </w:tr>
+      <w:tr>
+        <w:trPr>
+          <w:trHeight w:val="766"/>
+        </w:trPr>
+        <w:tc>
+          <w:tcPr>
+            <w:tcW w:w="4676" w:type="dxa"/>
+            <w:tcBorders>
+              <w:top w:val="single" w:sz="4" w:space="0" w:color="000000"/>
+              <w:left w:val="single" w:sz="4" w:space="0" w:color="000000"/>
+              <w:bottom w:val="single" w:sz="4" w:space="0" w:color="000000"/>
+              <w:right w:val="single" w:sz="4" w:space="0" w:color="000000"/>
+            </w:tcBorders>
+            <w:vAlign w:val="center"/>
+          </w:tcPr>
+          <w:p>
+            <w:pPr>
+              <w:spacing w:after="0" w:line="360" w:lineRule="auto"/>
+              <w:ind w:left="0" w:firstLine="0"/>
+            </w:pPr>
+            <w:r>
+              <w:t xml:space="preserve">other_devices_internet </w:t>
+            </w:r>
+          </w:p>
+        </w:tc>
+        <w:tc>
+          <w:tcPr>
+            <w:tcW w:w="4676" w:type="dxa"/>
+            <w:tcBorders>
+              <w:top w:val="single" w:sz="4" w:space="0" w:color="000000"/>
+              <w:left w:val="single" w:sz="4" w:space="0" w:color="000000"/>
+              <w:bottom w:val="single" w:sz="4" w:space="0" w:color="000000"/>
+              <w:right w:val="single" w:sz="4" w:space="0" w:color="000000"/>
+            </w:tcBorders>
+            <w:vAlign w:val="center"/>
+          </w:tcPr>
+          <w:p>
+            <w:pPr>
+              <w:spacing w:after="0" w:line="360" w:lineRule="auto"/>
+              <w:ind w:left="0" w:firstLine="0"/>
+            </w:pPr>
+            <w:r>
+              <w:t xml:space="preserve">Do other devices have internet on that Wi-Fi? </w:t>
+            </w:r>
+          </w:p>
+        </w:tc>
+      </w:tr>
+    </w:tbl>
+    <w:p>
+      <w:pPr>
+        <w:spacing w:line="480" w:lineRule="auto"/>
+        <w:ind w:left="0" w:firstLine="0"/>
         <w:rPr>
           <w:lang w:val="en-US"/>
         </w:rPr>

</xml_diff>

<commit_message>
docs: add knowledge acquisition sources and domain research (auth:maaraba-06)
</commit_message>
<xml_diff>
--- a/docs/KE DELIVERABLE.docx
+++ b/docs/KE DELIVERABLE.docx
@@ -1494,6 +1494,159 @@
         </w:tc>
       </w:tr>
     </w:tbl>
+    <w:p>
+      <w:pPr>
+        <w:spacing w:line="480" w:lineRule="auto"/>
+        <w:ind w:left="0" w:firstLine="0"/>
+        <w:rPr>
+          <w:lang w:val="en-US"/>
+        </w:rPr>
+      </w:pPr>
+    </w:p>
+    <w:p>
+      <w:pPr>
+        <w:spacing w:line="480" w:lineRule="auto"/>
+        <w:ind w:left="0" w:firstLine="0"/>
+        <w:rPr>
+          <w:lang w:val="en-US"/>
+        </w:rPr>
+      </w:pPr>
+    </w:p>
+    <w:p>
+      <w:pPr>
+        <w:spacing w:line="480" w:lineRule="auto"/>
+        <w:ind w:left="0" w:firstLine="0"/>
+        <w:rPr>
+          <w:lang w:val="en-US"/>
+        </w:rPr>
+      </w:pPr>
+    </w:p>
+    <w:p>
+      <w:pPr>
+        <w:spacing w:line="480" w:lineRule="auto"/>
+        <w:ind w:left="0" w:firstLine="0"/>
+        <w:rPr>
+          <w:lang w:val="en-US"/>
+        </w:rPr>
+      </w:pPr>
+    </w:p>
+    <w:p>
+      <w:pPr>
+        <w:spacing w:line="480" w:lineRule="auto"/>
+        <w:ind w:left="0" w:firstLine="0"/>
+        <w:rPr>
+          <w:lang w:val="en-US"/>
+        </w:rPr>
+      </w:pPr>
+    </w:p>
+    <w:p>
+      <w:pPr>
+        <w:spacing w:line="480" w:lineRule="auto"/>
+        <w:ind w:left="0" w:firstLine="0"/>
+        <w:rPr>
+          <w:lang w:val="en-US"/>
+        </w:rPr>
+      </w:pPr>
+    </w:p>
+    <w:p>
+      <w:pPr>
+        <w:spacing w:after="279" w:line="360" w:lineRule="auto"/>
+        <w:ind w:left="0" w:firstLine="0"/>
+        <w:rPr>
+          <w:rFonts w:eastAsiaTheme="majorEastAsia"/>
+          <w:b/>
+          <w:color w:val="0F4761" w:themeColor="accent1" w:themeShade="BF"/>
+          <w:sz w:val="32"/>
+          <w:szCs w:val="32"/>
+          <w:lang w:val="en-US"/>
+        </w:rPr>
+      </w:pPr>
+      <w:r>
+        <w:rPr>
+          <w:rFonts w:eastAsiaTheme="majorEastAsia"/>
+          <w:b/>
+          <w:color w:val="0F4761" w:themeColor="accent1" w:themeShade="BF"/>
+          <w:sz w:val="32"/>
+          <w:szCs w:val="32"/>
+          <w:lang w:val="en-US"/>
+        </w:rPr>
+        <w:lastRenderedPageBreak/>
+        <w:t>KNOWLEDGE ACQUISITION</w:t>
+      </w:r>
+    </w:p>
+    <w:p>
+      <w:pPr>
+        <w:spacing w:line="480" w:lineRule="auto"/>
+      </w:pPr>
+      <w:r>
+        <w:t>Knowledge about Wi</w:t>
+      </w:r>
+      <w:r>
+        <w:t>-</w:t>
+      </w:r>
+      <w:r>
+        <w:t>Fi troubleshooting was gathered from networking troubleshooting guides and technical resources. These sources explain common network problems and the steps technicians normally follow when diagnosing them.</w:t>
+      </w:r>
+    </w:p>
+    <w:p>
+      <w:pPr>
+        <w:spacing w:line="480" w:lineRule="auto"/>
+        <w:ind w:left="0" w:firstLine="345"/>
+      </w:pPr>
+      <w:r>
+        <w:t>Sources used during knowledge acquisition included:</w:t>
+      </w:r>
+    </w:p>
+    <w:p>
+      <w:pPr>
+        <w:spacing w:line="480" w:lineRule="auto"/>
+        <w:ind w:firstLine="720"/>
+      </w:pPr>
+      <w:r>
+        <w:t>• Cisco Networking Basics troubleshooting documentation</w:t>
+      </w:r>
+    </w:p>
+    <w:p>
+      <w:pPr>
+        <w:spacing w:line="480" w:lineRule="auto"/>
+        <w:ind w:firstLine="720"/>
+      </w:pPr>
+      <w:r>
+        <w:t>• How‑To Geek articles on common Wi</w:t>
+      </w:r>
+      <w:r>
+        <w:t>-</w:t>
+      </w:r>
+      <w:r>
+        <w:t>Fi connection problems</w:t>
+      </w:r>
+    </w:p>
+    <w:p>
+      <w:pPr>
+        <w:spacing w:line="480" w:lineRule="auto"/>
+        <w:ind w:firstLine="720"/>
+      </w:pPr>
+      <w:r>
+        <w:t>• GeeksforGeeks explanations of expert systems and rule‑based reasoning</w:t>
+      </w:r>
+    </w:p>
+    <w:p>
+      <w:pPr>
+        <w:spacing w:line="480" w:lineRule="auto"/>
+        <w:ind w:firstLine="720"/>
+      </w:pPr>
+      <w:r>
+        <w:t>• General IT troubleshooting practices used in laptop support</w:t>
+      </w:r>
+    </w:p>
+    <w:p>
+      <w:pPr>
+        <w:spacing w:line="480" w:lineRule="auto"/>
+      </w:pPr>
+      <w:r>
+        <w:t>From these sources, six common diagnoses were identified for the system: airplane_mode_enabled, wifi_disabled, adapter_or_driver_issue, password_or_profile_issue, dns_or_ip_stack_issue, and router_or_isp_problem.</w:t>
+      </w:r>
+    </w:p>
     <w:p>
       <w:pPr>
         <w:spacing w:line="480" w:lineRule="auto"/>

</xml_diff>

<commit_message>
docs: add rule conditions and troubleshooting advice for wifi issues (auth:maaraba-06)
</commit_message>
<xml_diff>
--- a/docs/KE DELIVERABLE.docx
+++ b/docs/KE DELIVERABLE.docx
@@ -1655,6 +1655,1477 @@
           <w:lang w:val="en-US"/>
         </w:rPr>
       </w:pPr>
+    </w:p>
+    <w:p>
+      <w:pPr>
+        <w:pStyle w:val="Heading2"/>
+        <w:spacing w:line="360" w:lineRule="auto"/>
+        <w:rPr>
+          <w:rFonts w:ascii="Times New Roman" w:hAnsi="Times New Roman" w:cs="Times New Roman"/>
+          <w:b/>
+          <w:sz w:val="32"/>
+          <w:szCs w:val="32"/>
+          <w:lang w:val="en-US"/>
+        </w:rPr>
+      </w:pPr>
+      <w:bookmarkStart w:id="4" w:name="_Toc223968945"/>
+      <w:r>
+        <w:rPr>
+          <w:rFonts w:ascii="Times New Roman" w:hAnsi="Times New Roman" w:cs="Times New Roman"/>
+          <w:b/>
+          <w:sz w:val="32"/>
+          <w:szCs w:val="32"/>
+          <w:lang w:val="en-US"/>
+        </w:rPr>
+        <w:t>DIAGNOSIS CONDITIONS (REQUIRED + NEGATIVE CONDITIONS)</w:t>
+      </w:r>
+      <w:bookmarkEnd w:id="4"/>
+      <w:r>
+        <w:rPr>
+          <w:rFonts w:ascii="Times New Roman" w:hAnsi="Times New Roman" w:cs="Times New Roman"/>
+          <w:b/>
+          <w:sz w:val="32"/>
+          <w:szCs w:val="32"/>
+          <w:lang w:val="en-US"/>
+        </w:rPr>
+        <w:t xml:space="preserve"> </w:t>
+      </w:r>
+    </w:p>
+    <w:p>
+      <w:pPr>
+        <w:spacing w:after="427" w:line="360" w:lineRule="auto"/>
+        <w:ind w:left="345" w:firstLine="0"/>
+        <w:jc w:val="both"/>
+      </w:pPr>
+      <w:r>
+        <w:t>The diagnostic conditions have been arranged in an order that reflects their relevance to the diagnosis process. However, this ordering does not imply that a condition with a higher confidence score will always result in a correct diagnosis. Instead, the confidence scores represent the likelihood or degree of belief associated with each condition, indicating how strongly the available evidence supports a particular diagnosis.</w:t>
+      </w:r>
+    </w:p>
+    <w:p>
+      <w:pPr>
+        <w:spacing w:after="211" w:line="360" w:lineRule="auto"/>
+        <w:ind w:left="720"/>
+      </w:pPr>
+    </w:p>
+    <w:tbl>
+      <w:tblPr>
+        <w:tblStyle w:val="TableGrid"/>
+        <w:tblW w:w="10055" w:type="dxa"/>
+        <w:tblInd w:w="5" w:type="dxa"/>
+        <w:tblCellMar>
+          <w:left w:w="108" w:type="dxa"/>
+          <w:right w:w="115" w:type="dxa"/>
+        </w:tblCellMar>
+        <w:tblLook w:val="04A0" w:firstRow="1" w:lastRow="0" w:firstColumn="1" w:lastColumn="0" w:noHBand="0" w:noVBand="1"/>
+      </w:tblPr>
+      <w:tblGrid>
+        <w:gridCol w:w="1266"/>
+        <w:gridCol w:w="3827"/>
+        <w:gridCol w:w="4962"/>
+      </w:tblGrid>
+      <w:tr>
+        <w:trPr>
+          <w:trHeight w:val="1044"/>
+        </w:trPr>
+        <w:tc>
+          <w:tcPr>
+            <w:tcW w:w="1266" w:type="dxa"/>
+            <w:tcBorders>
+              <w:top w:val="single" w:sz="4" w:space="0" w:color="000000"/>
+              <w:left w:val="single" w:sz="4" w:space="0" w:color="000000"/>
+              <w:bottom w:val="single" w:sz="4" w:space="0" w:color="000000"/>
+              <w:right w:val="single" w:sz="4" w:space="0" w:color="000000"/>
+            </w:tcBorders>
+          </w:tcPr>
+          <w:p>
+            <w:pPr>
+              <w:spacing w:after="0" w:line="360" w:lineRule="auto"/>
+              <w:ind w:left="0" w:firstLine="0"/>
+              <w:jc w:val="center"/>
+            </w:pPr>
+          </w:p>
+        </w:tc>
+        <w:tc>
+          <w:tcPr>
+            <w:tcW w:w="3827" w:type="dxa"/>
+            <w:tcBorders>
+              <w:top w:val="single" w:sz="4" w:space="0" w:color="000000"/>
+              <w:left w:val="single" w:sz="4" w:space="0" w:color="000000"/>
+              <w:bottom w:val="single" w:sz="4" w:space="0" w:color="000000"/>
+              <w:right w:val="single" w:sz="4" w:space="0" w:color="000000"/>
+            </w:tcBorders>
+          </w:tcPr>
+          <w:p>
+            <w:pPr>
+              <w:spacing w:after="0" w:line="360" w:lineRule="auto"/>
+              <w:ind w:left="0" w:firstLine="0"/>
+              <w:jc w:val="center"/>
+            </w:pPr>
+            <w:r>
+              <w:rPr>
+                <w:b/>
+              </w:rPr>
+              <w:t>Diagnosis</w:t>
+            </w:r>
+          </w:p>
+        </w:tc>
+        <w:tc>
+          <w:tcPr>
+            <w:tcW w:w="4962" w:type="dxa"/>
+            <w:tcBorders>
+              <w:top w:val="single" w:sz="4" w:space="0" w:color="000000"/>
+              <w:left w:val="single" w:sz="4" w:space="0" w:color="000000"/>
+              <w:bottom w:val="single" w:sz="4" w:space="0" w:color="000000"/>
+              <w:right w:val="single" w:sz="4" w:space="0" w:color="000000"/>
+            </w:tcBorders>
+            <w:vAlign w:val="bottom"/>
+          </w:tcPr>
+          <w:p>
+            <w:pPr>
+              <w:spacing w:after="235" w:line="360" w:lineRule="auto"/>
+              <w:ind w:left="0" w:firstLine="0"/>
+              <w:jc w:val="center"/>
+            </w:pPr>
+            <w:r>
+              <w:rPr>
+                <w:b/>
+              </w:rPr>
+              <w:t>Conditions</w:t>
+            </w:r>
+          </w:p>
+          <w:p>
+            <w:pPr>
+              <w:spacing w:after="0" w:line="360" w:lineRule="auto"/>
+              <w:ind w:left="0" w:firstLine="0"/>
+              <w:jc w:val="center"/>
+            </w:pPr>
+          </w:p>
+        </w:tc>
+      </w:tr>
+      <w:tr>
+        <w:trPr>
+          <w:trHeight w:val="260"/>
+        </w:trPr>
+        <w:tc>
+          <w:tcPr>
+            <w:tcW w:w="1266" w:type="dxa"/>
+            <w:tcBorders>
+              <w:top w:val="single" w:sz="4" w:space="0" w:color="000000"/>
+              <w:left w:val="single" w:sz="4" w:space="0" w:color="000000"/>
+              <w:bottom w:val="nil"/>
+              <w:right w:val="single" w:sz="4" w:space="0" w:color="000000"/>
+            </w:tcBorders>
+          </w:tcPr>
+          <w:p>
+            <w:pPr>
+              <w:spacing w:after="0" w:line="360" w:lineRule="auto"/>
+              <w:ind w:left="0" w:firstLine="0"/>
+            </w:pPr>
+            <w:r>
+              <w:t>1.</w:t>
+            </w:r>
+          </w:p>
+        </w:tc>
+        <w:tc>
+          <w:tcPr>
+            <w:tcW w:w="3827" w:type="dxa"/>
+            <w:tcBorders>
+              <w:top w:val="single" w:sz="4" w:space="0" w:color="000000"/>
+              <w:left w:val="single" w:sz="4" w:space="0" w:color="000000"/>
+              <w:bottom w:val="nil"/>
+              <w:right w:val="single" w:sz="4" w:space="0" w:color="000000"/>
+            </w:tcBorders>
+          </w:tcPr>
+          <w:p>
+            <w:pPr>
+              <w:spacing w:after="0" w:line="360" w:lineRule="auto"/>
+              <w:ind w:left="0" w:firstLine="0"/>
+            </w:pPr>
+          </w:p>
+        </w:tc>
+        <w:tc>
+          <w:tcPr>
+            <w:tcW w:w="4962" w:type="dxa"/>
+            <w:tcBorders>
+              <w:top w:val="single" w:sz="4" w:space="0" w:color="000000"/>
+              <w:left w:val="single" w:sz="4" w:space="0" w:color="000000"/>
+              <w:bottom w:val="nil"/>
+              <w:right w:val="single" w:sz="4" w:space="0" w:color="000000"/>
+            </w:tcBorders>
+          </w:tcPr>
+          <w:p>
+            <w:pPr>
+              <w:spacing w:after="0" w:line="360" w:lineRule="auto"/>
+              <w:ind w:left="0" w:firstLine="0"/>
+            </w:pPr>
+          </w:p>
+        </w:tc>
+      </w:tr>
+      <w:tr>
+        <w:trPr>
+          <w:trHeight w:val="1058"/>
+        </w:trPr>
+        <w:tc>
+          <w:tcPr>
+            <w:tcW w:w="1266" w:type="dxa"/>
+            <w:tcBorders>
+              <w:top w:val="nil"/>
+              <w:left w:val="single" w:sz="4" w:space="0" w:color="000000"/>
+              <w:bottom w:val="single" w:sz="4" w:space="0" w:color="000000"/>
+              <w:right w:val="single" w:sz="4" w:space="0" w:color="000000"/>
+            </w:tcBorders>
+          </w:tcPr>
+          <w:p>
+            <w:pPr>
+              <w:spacing w:after="0" w:line="360" w:lineRule="auto"/>
+              <w:ind w:left="0" w:firstLine="0"/>
+            </w:pPr>
+          </w:p>
+        </w:tc>
+        <w:tc>
+          <w:tcPr>
+            <w:tcW w:w="3827" w:type="dxa"/>
+            <w:tcBorders>
+              <w:top w:val="nil"/>
+              <w:left w:val="single" w:sz="4" w:space="0" w:color="000000"/>
+              <w:bottom w:val="single" w:sz="4" w:space="0" w:color="000000"/>
+              <w:right w:val="single" w:sz="4" w:space="0" w:color="000000"/>
+            </w:tcBorders>
+          </w:tcPr>
+          <w:p>
+            <w:pPr>
+              <w:spacing w:after="0" w:line="360" w:lineRule="auto"/>
+              <w:ind w:left="0" w:firstLine="0"/>
+            </w:pPr>
+            <w:r>
+              <w:t>airplane_mode_enabled</w:t>
+            </w:r>
+          </w:p>
+        </w:tc>
+        <w:tc>
+          <w:tcPr>
+            <w:tcW w:w="4962" w:type="dxa"/>
+            <w:tcBorders>
+              <w:top w:val="nil"/>
+              <w:left w:val="single" w:sz="4" w:space="0" w:color="000000"/>
+              <w:bottom w:val="single" w:sz="4" w:space="0" w:color="000000"/>
+              <w:right w:val="single" w:sz="4" w:space="0" w:color="000000"/>
+            </w:tcBorders>
+          </w:tcPr>
+          <w:p>
+            <w:pPr>
+              <w:pStyle w:val="ListParagraph"/>
+              <w:numPr>
+                <w:ilvl w:val="0"/>
+                <w:numId w:val="34"/>
+              </w:numPr>
+              <w:spacing w:after="240" w:line="360" w:lineRule="auto"/>
+            </w:pPr>
+            <w:r>
+              <w:t>airplane_mode = yes</w:t>
+            </w:r>
+          </w:p>
+          <w:p>
+            <w:pPr>
+              <w:spacing w:after="0" w:line="360" w:lineRule="auto"/>
+              <w:ind w:left="0" w:firstLine="0"/>
+            </w:pPr>
+          </w:p>
+        </w:tc>
+      </w:tr>
+      <w:tr>
+        <w:trPr>
+          <w:trHeight w:val="1594"/>
+        </w:trPr>
+        <w:tc>
+          <w:tcPr>
+            <w:tcW w:w="1266" w:type="dxa"/>
+            <w:tcBorders>
+              <w:top w:val="single" w:sz="4" w:space="0" w:color="000000"/>
+              <w:left w:val="single" w:sz="4" w:space="0" w:color="000000"/>
+              <w:bottom w:val="single" w:sz="4" w:space="0" w:color="000000"/>
+              <w:right w:val="single" w:sz="4" w:space="0" w:color="000000"/>
+            </w:tcBorders>
+          </w:tcPr>
+          <w:p>
+            <w:pPr>
+              <w:spacing w:after="0" w:line="360" w:lineRule="auto"/>
+              <w:ind w:left="0" w:firstLine="0"/>
+            </w:pPr>
+            <w:r>
+              <w:t>2.</w:t>
+            </w:r>
+          </w:p>
+        </w:tc>
+        <w:tc>
+          <w:tcPr>
+            <w:tcW w:w="3827" w:type="dxa"/>
+            <w:tcBorders>
+              <w:top w:val="single" w:sz="4" w:space="0" w:color="000000"/>
+              <w:left w:val="single" w:sz="4" w:space="0" w:color="000000"/>
+              <w:bottom w:val="single" w:sz="4" w:space="0" w:color="000000"/>
+              <w:right w:val="single" w:sz="4" w:space="0" w:color="000000"/>
+            </w:tcBorders>
+          </w:tcPr>
+          <w:p>
+            <w:pPr>
+              <w:spacing w:after="0" w:line="360" w:lineRule="auto"/>
+              <w:ind w:left="0" w:firstLine="0"/>
+            </w:pPr>
+            <w:r>
+              <w:t>wifi_disabled</w:t>
+            </w:r>
+          </w:p>
+        </w:tc>
+        <w:tc>
+          <w:tcPr>
+            <w:tcW w:w="4962" w:type="dxa"/>
+            <w:tcBorders>
+              <w:top w:val="single" w:sz="4" w:space="0" w:color="000000"/>
+              <w:left w:val="single" w:sz="4" w:space="0" w:color="000000"/>
+              <w:bottom w:val="single" w:sz="4" w:space="0" w:color="000000"/>
+              <w:right w:val="single" w:sz="4" w:space="0" w:color="000000"/>
+            </w:tcBorders>
+            <w:vAlign w:val="bottom"/>
+          </w:tcPr>
+          <w:p>
+            <w:pPr>
+              <w:numPr>
+                <w:ilvl w:val="0"/>
+                <w:numId w:val="9"/>
+              </w:numPr>
+              <w:spacing w:after="0" w:line="360" w:lineRule="auto"/>
+              <w:ind w:hanging="360"/>
+            </w:pPr>
+            <w:r>
+              <w:t>airplane_mode = no</w:t>
+            </w:r>
+          </w:p>
+          <w:p>
+            <w:pPr>
+              <w:spacing w:after="1" w:line="360" w:lineRule="auto"/>
+              <w:ind w:left="720" w:firstLine="0"/>
+            </w:pPr>
+            <w:r>
+              <w:rPr>
+                <w:i/>
+              </w:rPr>
+              <w:t>(negative condition)</w:t>
+            </w:r>
+          </w:p>
+          <w:p>
+            <w:pPr>
+              <w:numPr>
+                <w:ilvl w:val="0"/>
+                <w:numId w:val="9"/>
+              </w:numPr>
+              <w:spacing w:after="240" w:line="360" w:lineRule="auto"/>
+              <w:ind w:hanging="360"/>
+            </w:pPr>
+            <w:r>
+              <w:t>wifi_enabled = no</w:t>
+            </w:r>
+          </w:p>
+          <w:p>
+            <w:pPr>
+              <w:spacing w:after="0" w:line="360" w:lineRule="auto"/>
+              <w:ind w:left="0" w:firstLine="0"/>
+            </w:pPr>
+          </w:p>
+        </w:tc>
+      </w:tr>
+      <w:tr>
+        <w:trPr>
+          <w:trHeight w:val="1870"/>
+        </w:trPr>
+        <w:tc>
+          <w:tcPr>
+            <w:tcW w:w="1266" w:type="dxa"/>
+            <w:tcBorders>
+              <w:top w:val="single" w:sz="4" w:space="0" w:color="000000"/>
+              <w:left w:val="single" w:sz="4" w:space="0" w:color="000000"/>
+              <w:bottom w:val="single" w:sz="4" w:space="0" w:color="000000"/>
+              <w:right w:val="single" w:sz="4" w:space="0" w:color="000000"/>
+            </w:tcBorders>
+          </w:tcPr>
+          <w:p>
+            <w:pPr>
+              <w:spacing w:after="0" w:line="360" w:lineRule="auto"/>
+              <w:ind w:left="0" w:firstLine="0"/>
+            </w:pPr>
+            <w:r>
+              <w:t>3.</w:t>
+            </w:r>
+          </w:p>
+        </w:tc>
+        <w:tc>
+          <w:tcPr>
+            <w:tcW w:w="3827" w:type="dxa"/>
+            <w:tcBorders>
+              <w:top w:val="single" w:sz="4" w:space="0" w:color="000000"/>
+              <w:left w:val="single" w:sz="4" w:space="0" w:color="000000"/>
+              <w:bottom w:val="single" w:sz="4" w:space="0" w:color="000000"/>
+              <w:right w:val="single" w:sz="4" w:space="0" w:color="000000"/>
+            </w:tcBorders>
+          </w:tcPr>
+          <w:p>
+            <w:pPr>
+              <w:spacing w:after="0" w:line="360" w:lineRule="auto"/>
+              <w:ind w:left="0" w:firstLine="0"/>
+            </w:pPr>
+            <w:r>
+              <w:t>adapter_or_driver_issue</w:t>
+            </w:r>
+          </w:p>
+        </w:tc>
+        <w:tc>
+          <w:tcPr>
+            <w:tcW w:w="4962" w:type="dxa"/>
+            <w:tcBorders>
+              <w:top w:val="single" w:sz="4" w:space="0" w:color="000000"/>
+              <w:left w:val="single" w:sz="4" w:space="0" w:color="000000"/>
+              <w:bottom w:val="single" w:sz="4" w:space="0" w:color="000000"/>
+              <w:right w:val="single" w:sz="4" w:space="0" w:color="000000"/>
+            </w:tcBorders>
+            <w:vAlign w:val="bottom"/>
+          </w:tcPr>
+          <w:p>
+            <w:pPr>
+              <w:numPr>
+                <w:ilvl w:val="0"/>
+                <w:numId w:val="10"/>
+              </w:numPr>
+              <w:spacing w:after="0" w:line="360" w:lineRule="auto"/>
+              <w:ind w:hanging="360"/>
+            </w:pPr>
+            <w:r>
+              <w:t>airplane_mode = no</w:t>
+            </w:r>
+            <w:r>
+              <w:rPr>
+                <w:i/>
+              </w:rPr>
+              <w:t>(negative)</w:t>
+            </w:r>
+          </w:p>
+          <w:p>
+            <w:pPr>
+              <w:numPr>
+                <w:ilvl w:val="0"/>
+                <w:numId w:val="10"/>
+              </w:numPr>
+              <w:spacing w:after="0" w:line="360" w:lineRule="auto"/>
+              <w:ind w:hanging="360"/>
+            </w:pPr>
+            <w:r>
+              <w:t>wifi_enabled = yes</w:t>
+            </w:r>
+          </w:p>
+          <w:p>
+            <w:pPr>
+              <w:numPr>
+                <w:ilvl w:val="0"/>
+                <w:numId w:val="10"/>
+              </w:numPr>
+              <w:spacing w:after="240" w:line="360" w:lineRule="auto"/>
+              <w:ind w:hanging="360"/>
+            </w:pPr>
+            <w:r>
+              <w:t>sees_networks = no</w:t>
+            </w:r>
+          </w:p>
+          <w:p>
+            <w:pPr>
+              <w:spacing w:after="0" w:line="360" w:lineRule="auto"/>
+              <w:ind w:left="0" w:firstLine="0"/>
+            </w:pPr>
+          </w:p>
+        </w:tc>
+      </w:tr>
+      <w:tr>
+        <w:trPr>
+          <w:trHeight w:val="2698"/>
+        </w:trPr>
+        <w:tc>
+          <w:tcPr>
+            <w:tcW w:w="1266" w:type="dxa"/>
+            <w:tcBorders>
+              <w:top w:val="single" w:sz="4" w:space="0" w:color="000000"/>
+              <w:left w:val="single" w:sz="4" w:space="0" w:color="000000"/>
+              <w:bottom w:val="single" w:sz="4" w:space="0" w:color="000000"/>
+              <w:right w:val="single" w:sz="4" w:space="0" w:color="000000"/>
+            </w:tcBorders>
+          </w:tcPr>
+          <w:p>
+            <w:pPr>
+              <w:spacing w:after="0" w:line="360" w:lineRule="auto"/>
+              <w:ind w:left="0" w:firstLine="0"/>
+            </w:pPr>
+            <w:r>
+              <w:t>4.</w:t>
+            </w:r>
+          </w:p>
+        </w:tc>
+        <w:tc>
+          <w:tcPr>
+            <w:tcW w:w="3827" w:type="dxa"/>
+            <w:tcBorders>
+              <w:top w:val="single" w:sz="4" w:space="0" w:color="000000"/>
+              <w:left w:val="single" w:sz="4" w:space="0" w:color="000000"/>
+              <w:bottom w:val="single" w:sz="4" w:space="0" w:color="000000"/>
+              <w:right w:val="single" w:sz="4" w:space="0" w:color="000000"/>
+            </w:tcBorders>
+          </w:tcPr>
+          <w:p>
+            <w:pPr>
+              <w:spacing w:after="0" w:line="360" w:lineRule="auto"/>
+              <w:ind w:left="0" w:firstLine="0"/>
+            </w:pPr>
+            <w:r>
+              <w:t>password_or_profile_issue</w:t>
+            </w:r>
+          </w:p>
+        </w:tc>
+        <w:tc>
+          <w:tcPr>
+            <w:tcW w:w="4962" w:type="dxa"/>
+            <w:tcBorders>
+              <w:top w:val="single" w:sz="4" w:space="0" w:color="000000"/>
+              <w:left w:val="single" w:sz="4" w:space="0" w:color="000000"/>
+              <w:bottom w:val="single" w:sz="4" w:space="0" w:color="000000"/>
+              <w:right w:val="single" w:sz="4" w:space="0" w:color="000000"/>
+            </w:tcBorders>
+            <w:vAlign w:val="bottom"/>
+          </w:tcPr>
+          <w:p>
+            <w:pPr>
+              <w:numPr>
+                <w:ilvl w:val="0"/>
+                <w:numId w:val="11"/>
+              </w:numPr>
+              <w:spacing w:after="0" w:line="360" w:lineRule="auto"/>
+              <w:ind w:hanging="360"/>
+            </w:pPr>
+            <w:r>
+              <w:t>airplane_mode = no</w:t>
+            </w:r>
+            <w:r>
+              <w:rPr>
+                <w:lang w:val="en-US"/>
+              </w:rPr>
+              <w:t xml:space="preserve"> </w:t>
+            </w:r>
+            <w:r>
+              <w:rPr>
+                <w:i/>
+              </w:rPr>
+              <w:t>(negative)</w:t>
+            </w:r>
+          </w:p>
+          <w:p>
+            <w:pPr>
+              <w:numPr>
+                <w:ilvl w:val="0"/>
+                <w:numId w:val="11"/>
+              </w:numPr>
+              <w:spacing w:after="1" w:line="360" w:lineRule="auto"/>
+              <w:ind w:hanging="360"/>
+            </w:pPr>
+            <w:r>
+              <w:t>wifi_enabled = yes</w:t>
+            </w:r>
+          </w:p>
+          <w:p>
+            <w:pPr>
+              <w:numPr>
+                <w:ilvl w:val="0"/>
+                <w:numId w:val="11"/>
+              </w:numPr>
+              <w:spacing w:after="1" w:line="360" w:lineRule="auto"/>
+              <w:ind w:hanging="360"/>
+            </w:pPr>
+            <w:r>
+              <w:t>sees_networks = yes</w:t>
+            </w:r>
+          </w:p>
+          <w:p>
+            <w:pPr>
+              <w:numPr>
+                <w:ilvl w:val="0"/>
+                <w:numId w:val="11"/>
+              </w:numPr>
+              <w:spacing w:after="1" w:line="360" w:lineRule="auto"/>
+              <w:ind w:hanging="360"/>
+            </w:pPr>
+            <w:r>
+              <w:t>can_connect = no</w:t>
+            </w:r>
+          </w:p>
+          <w:p>
+            <w:pPr>
+              <w:numPr>
+                <w:ilvl w:val="0"/>
+                <w:numId w:val="11"/>
+              </w:numPr>
+              <w:spacing w:after="0" w:line="360" w:lineRule="auto"/>
+              <w:ind w:hanging="360"/>
+            </w:pPr>
+            <w:r>
+              <w:t>other_devices_connect</w:t>
+            </w:r>
+            <w:r>
+              <w:rPr>
+                <w:lang w:val="en-US"/>
+              </w:rPr>
+              <w:t xml:space="preserve"> </w:t>
+            </w:r>
+            <w:r>
+              <w:t>= yes</w:t>
+            </w:r>
+          </w:p>
+          <w:p>
+            <w:pPr>
+              <w:spacing w:after="0" w:line="360" w:lineRule="auto"/>
+              <w:ind w:left="0" w:firstLine="0"/>
+            </w:pPr>
+          </w:p>
+        </w:tc>
+      </w:tr>
+      <w:tr>
+        <w:trPr>
+          <w:trHeight w:val="1124"/>
+        </w:trPr>
+        <w:tc>
+          <w:tcPr>
+            <w:tcW w:w="1266" w:type="dxa"/>
+            <w:tcBorders>
+              <w:top w:val="single" w:sz="4" w:space="0" w:color="000000"/>
+              <w:left w:val="single" w:sz="4" w:space="0" w:color="000000"/>
+              <w:bottom w:val="single" w:sz="4" w:space="0" w:color="000000"/>
+              <w:right w:val="single" w:sz="4" w:space="0" w:color="000000"/>
+            </w:tcBorders>
+          </w:tcPr>
+          <w:p>
+            <w:pPr>
+              <w:spacing w:after="0" w:line="360" w:lineRule="auto"/>
+              <w:ind w:left="0" w:firstLine="0"/>
+            </w:pPr>
+            <w:r>
+              <w:t>5.</w:t>
+            </w:r>
+          </w:p>
+        </w:tc>
+        <w:tc>
+          <w:tcPr>
+            <w:tcW w:w="3827" w:type="dxa"/>
+            <w:tcBorders>
+              <w:top w:val="single" w:sz="4" w:space="0" w:color="000000"/>
+              <w:left w:val="single" w:sz="4" w:space="0" w:color="000000"/>
+              <w:bottom w:val="single" w:sz="4" w:space="0" w:color="000000"/>
+              <w:right w:val="single" w:sz="4" w:space="0" w:color="000000"/>
+            </w:tcBorders>
+          </w:tcPr>
+          <w:p>
+            <w:pPr>
+              <w:spacing w:after="0" w:line="360" w:lineRule="auto"/>
+              <w:ind w:left="0" w:firstLine="0"/>
+            </w:pPr>
+            <w:r>
+              <w:t>dns_or_ip_stack_issue</w:t>
+            </w:r>
+          </w:p>
+        </w:tc>
+        <w:tc>
+          <w:tcPr>
+            <w:tcW w:w="4962" w:type="dxa"/>
+            <w:tcBorders>
+              <w:top w:val="single" w:sz="4" w:space="0" w:color="000000"/>
+              <w:left w:val="single" w:sz="4" w:space="0" w:color="000000"/>
+              <w:bottom w:val="single" w:sz="4" w:space="0" w:color="000000"/>
+              <w:right w:val="single" w:sz="4" w:space="0" w:color="000000"/>
+            </w:tcBorders>
+            <w:vAlign w:val="bottom"/>
+          </w:tcPr>
+          <w:p>
+            <w:pPr>
+              <w:numPr>
+                <w:ilvl w:val="0"/>
+                <w:numId w:val="12"/>
+              </w:numPr>
+              <w:spacing w:after="1" w:line="360" w:lineRule="auto"/>
+              <w:ind w:hanging="360"/>
+            </w:pPr>
+            <w:r>
+              <w:t>connected_to_wifi = yes</w:t>
+            </w:r>
+          </w:p>
+          <w:p>
+            <w:pPr>
+              <w:numPr>
+                <w:ilvl w:val="0"/>
+                <w:numId w:val="12"/>
+              </w:numPr>
+              <w:spacing w:after="1" w:line="360" w:lineRule="auto"/>
+              <w:ind w:hanging="360"/>
+            </w:pPr>
+            <w:r>
+              <w:t>internet_access = no</w:t>
+            </w:r>
+          </w:p>
+          <w:p>
+            <w:pPr>
+              <w:numPr>
+                <w:ilvl w:val="0"/>
+                <w:numId w:val="12"/>
+              </w:numPr>
+              <w:spacing w:after="0" w:line="360" w:lineRule="auto"/>
+              <w:ind w:hanging="360"/>
+            </w:pPr>
+            <w:r>
+              <w:t>other_devices_internet</w:t>
+            </w:r>
+            <w:r>
+              <w:rPr>
+                <w:lang w:val="en-US"/>
+              </w:rPr>
+              <w:t xml:space="preserve"> </w:t>
+            </w:r>
+            <w:r>
+              <w:t>= yes</w:t>
+            </w:r>
+          </w:p>
+          <w:p>
+            <w:pPr>
+              <w:spacing w:after="0" w:line="360" w:lineRule="auto"/>
+              <w:ind w:left="0" w:firstLine="0"/>
+            </w:pPr>
+          </w:p>
+        </w:tc>
+      </w:tr>
+      <w:tr>
+        <w:trPr>
+          <w:trHeight w:val="3283"/>
+        </w:trPr>
+        <w:tc>
+          <w:tcPr>
+            <w:tcW w:w="1266" w:type="dxa"/>
+            <w:tcBorders>
+              <w:top w:val="single" w:sz="4" w:space="0" w:color="000000"/>
+              <w:left w:val="single" w:sz="4" w:space="0" w:color="000000"/>
+              <w:bottom w:val="single" w:sz="4" w:space="0" w:color="000000"/>
+              <w:right w:val="single" w:sz="4" w:space="0" w:color="000000"/>
+            </w:tcBorders>
+          </w:tcPr>
+          <w:p>
+            <w:pPr>
+              <w:spacing w:after="0" w:line="360" w:lineRule="auto"/>
+              <w:ind w:left="0" w:firstLine="0"/>
+            </w:pPr>
+            <w:r>
+              <w:lastRenderedPageBreak/>
+              <w:t>6.</w:t>
+            </w:r>
+          </w:p>
+        </w:tc>
+        <w:tc>
+          <w:tcPr>
+            <w:tcW w:w="3827" w:type="dxa"/>
+            <w:tcBorders>
+              <w:top w:val="single" w:sz="4" w:space="0" w:color="000000"/>
+              <w:left w:val="single" w:sz="4" w:space="0" w:color="000000"/>
+              <w:bottom w:val="single" w:sz="4" w:space="0" w:color="000000"/>
+              <w:right w:val="single" w:sz="4" w:space="0" w:color="000000"/>
+            </w:tcBorders>
+          </w:tcPr>
+          <w:p>
+            <w:pPr>
+              <w:spacing w:after="0" w:line="360" w:lineRule="auto"/>
+              <w:ind w:left="0" w:firstLine="0"/>
+            </w:pPr>
+            <w:r>
+              <w:t>router_or_isp_problem</w:t>
+            </w:r>
+          </w:p>
+        </w:tc>
+        <w:tc>
+          <w:tcPr>
+            <w:tcW w:w="4962" w:type="dxa"/>
+            <w:tcBorders>
+              <w:top w:val="single" w:sz="4" w:space="0" w:color="000000"/>
+              <w:left w:val="single" w:sz="4" w:space="0" w:color="000000"/>
+              <w:bottom w:val="single" w:sz="4" w:space="0" w:color="000000"/>
+              <w:right w:val="single" w:sz="4" w:space="0" w:color="000000"/>
+            </w:tcBorders>
+            <w:vAlign w:val="bottom"/>
+          </w:tcPr>
+          <w:p>
+            <w:pPr>
+              <w:spacing w:after="0" w:line="360" w:lineRule="auto"/>
+              <w:ind w:left="720" w:firstLine="0"/>
+            </w:pPr>
+            <w:r>
+              <w:rPr>
+                <w:b/>
+              </w:rPr>
+              <w:t>Pattern A</w:t>
+            </w:r>
+          </w:p>
+          <w:p>
+            <w:pPr>
+              <w:numPr>
+                <w:ilvl w:val="0"/>
+                <w:numId w:val="13"/>
+              </w:numPr>
+              <w:spacing w:after="0" w:line="360" w:lineRule="auto"/>
+              <w:ind w:hanging="360"/>
+            </w:pPr>
+            <w:r>
+              <w:t xml:space="preserve">other_devices_connect </w:t>
+            </w:r>
+            <w:r>
+              <w:t>= no</w:t>
+            </w:r>
+          </w:p>
+          <w:p>
+            <w:pPr>
+              <w:spacing w:after="44" w:line="360" w:lineRule="auto"/>
+              <w:ind w:left="0" w:firstLine="0"/>
+            </w:pPr>
+            <w:r>
+              <w:rPr>
+                <w:b/>
+                <w:lang w:val="en-US"/>
+              </w:rPr>
+              <w:t xml:space="preserve">                             </w:t>
+            </w:r>
+            <w:r>
+              <w:rPr>
+                <w:b/>
+              </w:rPr>
+              <w:t>OR</w:t>
+            </w:r>
+          </w:p>
+          <w:p>
+            <w:pPr>
+              <w:spacing w:after="0" w:line="360" w:lineRule="auto"/>
+              <w:ind w:left="720" w:firstLine="0"/>
+            </w:pPr>
+            <w:r>
+              <w:rPr>
+                <w:b/>
+              </w:rPr>
+              <w:t>Pattern B</w:t>
+            </w:r>
+          </w:p>
+          <w:p>
+            <w:pPr>
+              <w:numPr>
+                <w:ilvl w:val="0"/>
+                <w:numId w:val="13"/>
+              </w:numPr>
+              <w:spacing w:after="0" w:line="360" w:lineRule="auto"/>
+              <w:ind w:hanging="360"/>
+            </w:pPr>
+            <w:r>
+              <w:t>other_devices_internet</w:t>
+            </w:r>
+            <w:r>
+              <w:rPr>
+                <w:lang w:val="en-US"/>
+              </w:rPr>
+              <w:t xml:space="preserve"> </w:t>
+            </w:r>
+            <w:r>
+              <w:t>= no</w:t>
+            </w:r>
+          </w:p>
+          <w:p>
+            <w:pPr>
+              <w:spacing w:after="0" w:line="360" w:lineRule="auto"/>
+              <w:ind w:left="720" w:firstLine="0"/>
+              <w:rPr>
+                <w:i/>
+              </w:rPr>
+            </w:pPr>
+          </w:p>
+          <w:p>
+            <w:pPr>
+              <w:spacing w:after="0" w:line="360" w:lineRule="auto"/>
+              <w:ind w:left="720" w:firstLine="0"/>
+            </w:pPr>
+            <w:r>
+              <w:rPr>
+                <w:i/>
+              </w:rPr>
+              <w:t>(Programmers can</w:t>
+            </w:r>
+          </w:p>
+          <w:p>
+            <w:pPr>
+              <w:spacing w:after="240" w:line="360" w:lineRule="auto"/>
+              <w:ind w:left="720" w:firstLine="0"/>
+            </w:pPr>
+            <w:r>
+              <w:rPr>
+                <w:i/>
+              </w:rPr>
+              <w:t>implement this as an OR rule because one of these patterns is enough.)</w:t>
+            </w:r>
+          </w:p>
+          <w:p>
+            <w:pPr>
+              <w:spacing w:after="0" w:line="360" w:lineRule="auto"/>
+              <w:ind w:left="0" w:firstLine="0"/>
+            </w:pPr>
+          </w:p>
+        </w:tc>
+      </w:tr>
+    </w:tbl>
+    <w:p>
+      <w:pPr>
+        <w:spacing w:after="0" w:line="360" w:lineRule="auto"/>
+        <w:ind w:left="0" w:firstLine="0"/>
+      </w:pPr>
+      <w:r>
+        <w:t xml:space="preserve"> </w:t>
+      </w:r>
+    </w:p>
+    <w:p>
+      <w:pPr>
+        <w:spacing w:after="0" w:line="360" w:lineRule="auto"/>
+        <w:ind w:left="0" w:firstLine="0"/>
+      </w:pPr>
+    </w:p>
+    <w:p>
+      <w:pPr>
+        <w:spacing w:after="407" w:line="360" w:lineRule="auto"/>
+        <w:ind w:left="0" w:right="-15" w:firstLine="0"/>
+        <w:rPr>
+          <w:rFonts w:eastAsia="Arial"/>
+          <w:b/>
+          <w:sz w:val="32"/>
+          <w:szCs w:val="32"/>
+          <w:lang w:val="en-US"/>
+        </w:rPr>
+      </w:pPr>
+    </w:p>
+    <w:p>
+      <w:pPr>
+        <w:spacing w:after="407" w:line="360" w:lineRule="auto"/>
+        <w:ind w:left="-5" w:right="-15"/>
+        <w:rPr>
+          <w:rFonts w:eastAsiaTheme="majorEastAsia"/>
+          <w:b/>
+          <w:color w:val="0F4761" w:themeColor="accent1" w:themeShade="BF"/>
+          <w:sz w:val="32"/>
+          <w:szCs w:val="32"/>
+          <w:lang w:val="en-US"/>
+        </w:rPr>
+      </w:pPr>
+      <w:r>
+        <w:rPr>
+          <w:rFonts w:eastAsiaTheme="majorEastAsia"/>
+          <w:b/>
+          <w:color w:val="0F4761" w:themeColor="accent1" w:themeShade="BF"/>
+          <w:sz w:val="32"/>
+          <w:szCs w:val="32"/>
+          <w:lang w:val="en-US"/>
+        </w:rPr>
+        <w:t>ADVICE (3–4 STEPS EACH)</w:t>
+      </w:r>
+    </w:p>
+    <w:p>
+      <w:pPr>
+        <w:pStyle w:val="ListParagraph"/>
+        <w:numPr>
+          <w:ilvl w:val="0"/>
+          <w:numId w:val="17"/>
+        </w:numPr>
+        <w:spacing w:after="333" w:line="360" w:lineRule="auto"/>
+        <w:ind w:right="-15"/>
+        <w:rPr>
+          <w:rStyle w:val="Strong"/>
+        </w:rPr>
+      </w:pPr>
+      <w:r>
+        <w:rPr>
+          <w:rStyle w:val="Strong"/>
+          <w:rFonts w:eastAsia="Arial"/>
+        </w:rPr>
+        <w:t xml:space="preserve">airplane_mode_enabled </w:t>
+      </w:r>
+    </w:p>
+    <w:p>
+      <w:pPr>
+        <w:numPr>
+          <w:ilvl w:val="2"/>
+          <w:numId w:val="25"/>
+        </w:numPr>
+        <w:spacing w:line="360" w:lineRule="auto"/>
+        <w:ind w:hanging="360"/>
+      </w:pPr>
+      <w:r>
+        <w:t xml:space="preserve">Turn off Airplane Mode. </w:t>
+      </w:r>
+    </w:p>
+    <w:p>
+      <w:pPr>
+        <w:numPr>
+          <w:ilvl w:val="2"/>
+          <w:numId w:val="25"/>
+        </w:numPr>
+        <w:spacing w:line="360" w:lineRule="auto"/>
+        <w:ind w:hanging="360"/>
+      </w:pPr>
+      <w:r>
+        <w:t xml:space="preserve">Enable Wi-Fi afterwards if it remains off. </w:t>
+      </w:r>
+    </w:p>
+    <w:p>
+      <w:pPr>
+        <w:numPr>
+          <w:ilvl w:val="2"/>
+          <w:numId w:val="25"/>
+        </w:numPr>
+        <w:spacing w:line="360" w:lineRule="auto"/>
+        <w:ind w:hanging="360"/>
+      </w:pPr>
+      <w:r>
+        <w:t xml:space="preserve"> Reconnect to the Wi-Fi network. </w:t>
+      </w:r>
+    </w:p>
+    <w:p>
+      <w:pPr>
+        <w:numPr>
+          <w:ilvl w:val="2"/>
+          <w:numId w:val="25"/>
+        </w:numPr>
+        <w:spacing w:line="360" w:lineRule="auto"/>
+        <w:ind w:hanging="360"/>
+      </w:pPr>
+      <w:r>
+        <w:t xml:space="preserve">Restart the laptop if Wi-Fi still doesn’t appear. </w:t>
+      </w:r>
+    </w:p>
+    <w:p>
+      <w:pPr>
+        <w:spacing w:line="360" w:lineRule="auto"/>
+        <w:ind w:left="1440" w:firstLine="0"/>
+      </w:pPr>
+    </w:p>
+    <w:p>
+      <w:pPr>
+        <w:pStyle w:val="ListParagraph"/>
+        <w:numPr>
+          <w:ilvl w:val="0"/>
+          <w:numId w:val="17"/>
+        </w:numPr>
+        <w:spacing w:after="333" w:line="360" w:lineRule="auto"/>
+        <w:ind w:right="-15"/>
+        <w:rPr>
+          <w:rStyle w:val="Strong"/>
+          <w:rFonts w:eastAsia="Arial"/>
+        </w:rPr>
+      </w:pPr>
+      <w:r>
+        <w:rPr>
+          <w:rStyle w:val="Strong"/>
+          <w:rFonts w:eastAsia="Arial"/>
+        </w:rPr>
+        <w:t xml:space="preserve">wifi_disabled </w:t>
+      </w:r>
+    </w:p>
+    <w:p>
+      <w:pPr>
+        <w:numPr>
+          <w:ilvl w:val="2"/>
+          <w:numId w:val="26"/>
+        </w:numPr>
+        <w:spacing w:line="360" w:lineRule="auto"/>
+        <w:ind w:hanging="360"/>
+      </w:pPr>
+      <w:r>
+        <w:t xml:space="preserve">Turn on Wi-Fi from settings (or the Wi-Fi key/switch). </w:t>
+      </w:r>
+    </w:p>
+    <w:p>
+      <w:pPr>
+        <w:numPr>
+          <w:ilvl w:val="2"/>
+          <w:numId w:val="26"/>
+        </w:numPr>
+        <w:spacing w:line="360" w:lineRule="auto"/>
+        <w:ind w:hanging="360"/>
+      </w:pPr>
+      <w:r>
+        <w:t xml:space="preserve">Confirm the Wi-Fi adapter is enabled in network settings. </w:t>
+      </w:r>
+    </w:p>
+    <w:p>
+      <w:pPr>
+        <w:numPr>
+          <w:ilvl w:val="2"/>
+          <w:numId w:val="26"/>
+        </w:numPr>
+        <w:spacing w:line="360" w:lineRule="auto"/>
+        <w:ind w:hanging="360"/>
+      </w:pPr>
+      <w:r>
+        <w:t xml:space="preserve">Reconnect to the correct network. </w:t>
+      </w:r>
+    </w:p>
+    <w:p>
+      <w:pPr>
+        <w:numPr>
+          <w:ilvl w:val="2"/>
+          <w:numId w:val="26"/>
+        </w:numPr>
+        <w:spacing w:line="360" w:lineRule="auto"/>
+        <w:ind w:hanging="360"/>
+      </w:pPr>
+      <w:r>
+        <w:lastRenderedPageBreak/>
+        <w:t>Restart the laptop if Wi-Fi won’t enable.</w:t>
+      </w:r>
+    </w:p>
+    <w:p>
+      <w:pPr>
+        <w:spacing w:line="360" w:lineRule="auto"/>
+        <w:ind w:left="705" w:firstLine="0"/>
+      </w:pPr>
+      <w:r>
+        <w:t xml:space="preserve"> </w:t>
+      </w:r>
+    </w:p>
+    <w:p>
+      <w:pPr>
+        <w:pStyle w:val="ListParagraph"/>
+        <w:numPr>
+          <w:ilvl w:val="0"/>
+          <w:numId w:val="17"/>
+        </w:numPr>
+        <w:spacing w:after="333" w:line="360" w:lineRule="auto"/>
+        <w:ind w:right="-15"/>
+        <w:rPr>
+          <w:rStyle w:val="Strong"/>
+          <w:rFonts w:eastAsia="Arial"/>
+        </w:rPr>
+      </w:pPr>
+      <w:r>
+        <w:rPr>
+          <w:rStyle w:val="Strong"/>
+          <w:rFonts w:eastAsia="Arial"/>
+        </w:rPr>
+        <w:t xml:space="preserve">adapter_or_driver_issue </w:t>
+      </w:r>
+    </w:p>
+    <w:p>
+      <w:pPr>
+        <w:numPr>
+          <w:ilvl w:val="2"/>
+          <w:numId w:val="27"/>
+        </w:numPr>
+        <w:spacing w:line="360" w:lineRule="auto"/>
+        <w:ind w:hanging="360"/>
+      </w:pPr>
+      <w:r>
+        <w:t xml:space="preserve">Restart the laptop. </w:t>
+      </w:r>
+    </w:p>
+    <w:p>
+      <w:pPr>
+        <w:numPr>
+          <w:ilvl w:val="2"/>
+          <w:numId w:val="27"/>
+        </w:numPr>
+        <w:spacing w:line="360" w:lineRule="auto"/>
+        <w:ind w:hanging="360"/>
+      </w:pPr>
+      <w:r>
+        <w:t xml:space="preserve">Check the Wi-Fi adapter is enabled (Device Manager / Network settings). </w:t>
+      </w:r>
+    </w:p>
+    <w:p>
+      <w:pPr>
+        <w:numPr>
+          <w:ilvl w:val="2"/>
+          <w:numId w:val="27"/>
+        </w:numPr>
+        <w:spacing w:line="360" w:lineRule="auto"/>
+        <w:ind w:hanging="360"/>
+      </w:pPr>
+      <w:r>
+        <w:t xml:space="preserve">Update or reinstall the Wi-Fi driver. </w:t>
+      </w:r>
+    </w:p>
+    <w:p>
+      <w:pPr>
+        <w:numPr>
+          <w:ilvl w:val="2"/>
+          <w:numId w:val="27"/>
+        </w:numPr>
+        <w:spacing w:line="360" w:lineRule="auto"/>
+        <w:ind w:hanging="360"/>
+      </w:pPr>
+      <w:r>
+        <w:t xml:space="preserve">Test with a mobile hotspot or USB Wi-Fi adapter to isolate hardware issues. </w:t>
+      </w:r>
+    </w:p>
+    <w:p>
+      <w:pPr>
+        <w:spacing w:line="360" w:lineRule="auto"/>
+        <w:ind w:left="1440" w:firstLine="0"/>
+      </w:pPr>
+    </w:p>
+    <w:p>
+      <w:pPr>
+        <w:pStyle w:val="ListParagraph"/>
+        <w:numPr>
+          <w:ilvl w:val="0"/>
+          <w:numId w:val="17"/>
+        </w:numPr>
+        <w:spacing w:after="333" w:line="360" w:lineRule="auto"/>
+        <w:ind w:right="-15"/>
+        <w:rPr>
+          <w:rStyle w:val="Strong"/>
+          <w:rFonts w:eastAsia="Arial"/>
+        </w:rPr>
+      </w:pPr>
+      <w:r>
+        <w:rPr>
+          <w:rStyle w:val="Strong"/>
+          <w:rFonts w:eastAsia="Arial"/>
+        </w:rPr>
+        <w:t xml:space="preserve">password_or_profile_issue </w:t>
+      </w:r>
+    </w:p>
+    <w:p>
+      <w:pPr>
+        <w:numPr>
+          <w:ilvl w:val="2"/>
+          <w:numId w:val="28"/>
+        </w:numPr>
+        <w:spacing w:line="360" w:lineRule="auto"/>
+        <w:ind w:hanging="360"/>
+      </w:pPr>
+      <w:r>
+        <w:t xml:space="preserve">“Forget” the Wi-Fi network and reconnect. </w:t>
+      </w:r>
+    </w:p>
+    <w:p>
+      <w:pPr>
+        <w:numPr>
+          <w:ilvl w:val="2"/>
+          <w:numId w:val="28"/>
+        </w:numPr>
+        <w:spacing w:line="360" w:lineRule="auto"/>
+        <w:ind w:hanging="360"/>
+      </w:pPr>
+      <w:r>
+        <w:t xml:space="preserve">Re-enter the password carefully (confirm it’s the latest one). </w:t>
+      </w:r>
+    </w:p>
+    <w:p>
+      <w:pPr>
+        <w:numPr>
+          <w:ilvl w:val="2"/>
+          <w:numId w:val="28"/>
+        </w:numPr>
+        <w:spacing w:line="360" w:lineRule="auto"/>
+        <w:ind w:hanging="360"/>
+      </w:pPr>
+      <w:r>
+        <w:t xml:space="preserve">Restart the router and try again. </w:t>
+      </w:r>
+    </w:p>
+    <w:p>
+      <w:pPr>
+        <w:numPr>
+          <w:ilvl w:val="2"/>
+          <w:numId w:val="28"/>
+        </w:numPr>
+        <w:spacing w:line="360" w:lineRule="auto"/>
+        <w:ind w:hanging="360"/>
+      </w:pPr>
+      <w:r>
+        <w:t xml:space="preserve">Try connecting to a mobile hotspot to confirm the laptop can connect elsewhere. </w:t>
+      </w:r>
+    </w:p>
+    <w:p>
+      <w:pPr>
+        <w:spacing w:after="287" w:line="360" w:lineRule="auto"/>
+        <w:ind w:left="720" w:firstLine="0"/>
+      </w:pPr>
+      <w:r>
+        <w:t xml:space="preserve"> </w:t>
+      </w:r>
+    </w:p>
+    <w:p>
+      <w:pPr>
+        <w:pStyle w:val="ListParagraph"/>
+        <w:numPr>
+          <w:ilvl w:val="0"/>
+          <w:numId w:val="17"/>
+        </w:numPr>
+        <w:spacing w:after="333" w:line="360" w:lineRule="auto"/>
+        <w:ind w:right="-15"/>
+        <w:rPr>
+          <w:rStyle w:val="Strong"/>
+          <w:rFonts w:eastAsia="Arial"/>
+        </w:rPr>
+      </w:pPr>
+      <w:r>
+        <w:rPr>
+          <w:rStyle w:val="Strong"/>
+          <w:rFonts w:eastAsia="Arial"/>
+        </w:rPr>
+        <w:t xml:space="preserve">dns_or_ip_stack_issue </w:t>
+      </w:r>
+    </w:p>
+    <w:p>
+      <w:pPr>
+        <w:pStyle w:val="ListParagraph"/>
+        <w:spacing w:after="333" w:line="360" w:lineRule="auto"/>
+        <w:ind w:right="-15" w:firstLine="0"/>
+        <w:rPr>
+          <w:rStyle w:val="Strong"/>
+          <w:rFonts w:eastAsia="Arial"/>
+        </w:rPr>
+      </w:pPr>
+    </w:p>
+    <w:p>
+      <w:pPr>
+        <w:pStyle w:val="ListParagraph"/>
+        <w:numPr>
+          <w:ilvl w:val="0"/>
+          <w:numId w:val="33"/>
+        </w:numPr>
+        <w:spacing w:line="360" w:lineRule="auto"/>
+      </w:pPr>
+      <w:r>
+        <w:t xml:space="preserve">Disconnect and reconnect to Wi-Fi. </w:t>
+      </w:r>
+    </w:p>
+    <w:p>
+      <w:pPr>
+        <w:pStyle w:val="ListParagraph"/>
+        <w:numPr>
+          <w:ilvl w:val="0"/>
+          <w:numId w:val="33"/>
+        </w:numPr>
+        <w:spacing w:line="360" w:lineRule="auto"/>
+      </w:pPr>
+      <w:r>
+        <w:t xml:space="preserve">Renew IP / DHCP (or run the network troubleshooter). </w:t>
+      </w:r>
+    </w:p>
+    <w:p>
+      <w:pPr>
+        <w:pStyle w:val="ListParagraph"/>
+        <w:numPr>
+          <w:ilvl w:val="0"/>
+          <w:numId w:val="33"/>
+        </w:numPr>
+        <w:spacing w:line="360" w:lineRule="auto"/>
+      </w:pPr>
+      <w:r>
+        <w:t xml:space="preserve">Flush DNS and retry. </w:t>
+      </w:r>
+    </w:p>
+    <w:p>
+      <w:pPr>
+        <w:pStyle w:val="ListParagraph"/>
+        <w:numPr>
+          <w:ilvl w:val="0"/>
+          <w:numId w:val="33"/>
+        </w:numPr>
+        <w:spacing w:line="360" w:lineRule="auto"/>
+      </w:pPr>
+      <w:r>
+        <w:t xml:space="preserve">Temporarily change DNS to a public DNS (e.g., 8.8.8.8 or 1.1.1.1) to test. </w:t>
+      </w:r>
+    </w:p>
+    <w:p>
+      <w:pPr>
+        <w:pStyle w:val="ListParagraph"/>
+        <w:spacing w:after="333" w:line="360" w:lineRule="auto"/>
+        <w:ind w:right="-15" w:firstLine="0"/>
+        <w:rPr>
+          <w:rFonts w:eastAsia="Arial"/>
+          <w:b/>
+          <w:bCs/>
+        </w:rPr>
+      </w:pPr>
+    </w:p>
+    <w:p>
+      <w:pPr>
+        <w:spacing w:after="333" w:line="360" w:lineRule="auto"/>
+        <w:ind w:right="-15"/>
+        <w:rPr>
+          <w:rStyle w:val="Strong"/>
+          <w:rFonts w:eastAsia="Arial"/>
+        </w:rPr>
+      </w:pPr>
+      <w:r>
+        <w:rPr>
+          <w:rStyle w:val="Strong"/>
+          <w:rFonts w:eastAsia="Arial"/>
+        </w:rPr>
+        <w:t xml:space="preserve">6. router_or_isp_problem </w:t>
+      </w:r>
+    </w:p>
+    <w:p>
+      <w:pPr>
+        <w:numPr>
+          <w:ilvl w:val="2"/>
+          <w:numId w:val="30"/>
+        </w:numPr>
+        <w:spacing w:line="360" w:lineRule="auto"/>
+        <w:ind w:hanging="360"/>
+      </w:pPr>
+      <w:r>
+        <w:t xml:space="preserve">Restart the router (power off ~10 seconds, then on). </w:t>
+      </w:r>
+    </w:p>
+    <w:p>
+      <w:pPr>
+        <w:numPr>
+          <w:ilvl w:val="2"/>
+          <w:numId w:val="30"/>
+        </w:numPr>
+        <w:spacing w:line="360" w:lineRule="auto"/>
+        <w:ind w:hanging="360"/>
+      </w:pPr>
+      <w:r>
+        <w:t xml:space="preserve">Check the router’s Internet/WAN indicator lights. </w:t>
+      </w:r>
+    </w:p>
+    <w:p>
+      <w:pPr>
+        <w:numPr>
+          <w:ilvl w:val="2"/>
+          <w:numId w:val="30"/>
+        </w:numPr>
+        <w:spacing w:line="360" w:lineRule="auto"/>
+        <w:ind w:hanging="360"/>
+      </w:pPr>
+      <w:r>
+        <w:t xml:space="preserve">Try another network (mobile hotspot) to confirm the laptop is not the issue. </w:t>
+      </w:r>
+    </w:p>
+    <w:p>
+      <w:pPr>
+        <w:numPr>
+          <w:ilvl w:val="2"/>
+          <w:numId w:val="30"/>
+        </w:numPr>
+        <w:spacing w:after="284" w:line="360" w:lineRule="auto"/>
+        <w:ind w:hanging="360"/>
+      </w:pPr>
+      <w:r>
+        <w:lastRenderedPageBreak/>
+        <w:t xml:space="preserve">Contact the ISP if the internet remains down for all devices. </w:t>
+      </w:r>
     </w:p>
     <w:p>
       <w:pPr>

</xml_diff>

<commit_message>
docs: add inference explanation test cases and final report sections (auth:maaraba-06)
</commit_message>
<xml_diff>
--- a/docs/KE DELIVERABLE.docx
+++ b/docs/KE DELIVERABLE.docx
@@ -2592,12 +2592,6 @@
     </w:p>
     <w:p>
       <w:pPr>
-        <w:spacing w:after="0" w:line="360" w:lineRule="auto"/>
-        <w:ind w:left="0" w:firstLine="0"/>
-      </w:pPr>
-    </w:p>
-    <w:p>
-      <w:pPr>
         <w:spacing w:after="407" w:line="360" w:lineRule="auto"/>
         <w:ind w:left="0" w:right="-15" w:firstLine="0"/>
         <w:rPr>
@@ -2784,7 +2778,6 @@
         <w:ind w:hanging="360"/>
       </w:pPr>
       <w:r>
-        <w:lastRenderedPageBreak/>
         <w:t>Restart the laptop if Wi-Fi won’t enable.</w:t>
       </w:r>
     </w:p>
@@ -2794,6 +2787,7 @@
         <w:ind w:left="705" w:firstLine="0"/>
       </w:pPr>
       <w:r>
+        <w:lastRenderedPageBreak/>
         <w:t xml:space="preserve"> </w:t>
       </w:r>
     </w:p>
@@ -3123,9 +3117,1581 @@
         <w:ind w:hanging="360"/>
       </w:pPr>
       <w:r>
-        <w:lastRenderedPageBreak/>
         <w:t xml:space="preserve">Contact the ISP if the internet remains down for all devices. </w:t>
       </w:r>
+    </w:p>
+    <w:p>
+      <w:pPr>
+        <w:spacing w:after="428" w:line="360" w:lineRule="auto"/>
+        <w:ind w:left="0" w:firstLine="0"/>
+        <w:rPr>
+          <w:rFonts w:eastAsiaTheme="majorEastAsia"/>
+          <w:b/>
+          <w:color w:val="0F4761" w:themeColor="accent1" w:themeShade="BF"/>
+          <w:sz w:val="32"/>
+          <w:szCs w:val="32"/>
+        </w:rPr>
+      </w:pPr>
+      <w:bookmarkStart w:id="5" w:name="_Toc223968946"/>
+      <w:r>
+        <w:rPr>
+          <w:rStyle w:val="Heading1Char"/>
+          <w:rFonts w:ascii="Times New Roman" w:hAnsi="Times New Roman" w:cs="Times New Roman"/>
+          <w:b/>
+        </w:rPr>
+        <w:lastRenderedPageBreak/>
+        <w:t>INFERENCE PROCES</w:t>
+      </w:r>
+      <w:r>
+        <w:rPr>
+          <w:rStyle w:val="Heading1Char"/>
+          <w:rFonts w:ascii="Times New Roman" w:hAnsi="Times New Roman" w:cs="Times New Roman"/>
+          <w:b/>
+        </w:rPr>
+        <w:t>S</w:t>
+      </w:r>
+      <w:bookmarkEnd w:id="5"/>
+    </w:p>
+    <w:p>
+      <w:pPr>
+        <w:spacing w:line="480" w:lineRule="auto"/>
+        <w:rPr>
+          <w:lang w:val="en-US"/>
+        </w:rPr>
+      </w:pPr>
+      <w:r>
+        <w:t>The inference engine evaluates the rules in the knowledge base and determines the most likely diagnosis. The Python interface collects user responses and sends them to the Prolog engine, which evaluates the rules and</w:t>
+      </w:r>
+      <w:r>
+        <w:t xml:space="preserve"> selects the matching diagnosis </w:t>
+      </w:r>
+      <w:r>
+        <w:rPr>
+          <w:lang w:val="en-US"/>
+        </w:rPr>
+        <w:t>explained as follows:</w:t>
+      </w:r>
+    </w:p>
+    <w:p>
+      <w:pPr>
+        <w:spacing w:after="428" w:line="360" w:lineRule="auto"/>
+        <w:ind w:left="0" w:firstLine="0"/>
+      </w:pPr>
+    </w:p>
+    <w:p>
+      <w:pPr>
+        <w:spacing w:after="428" w:line="360" w:lineRule="auto"/>
+        <w:ind w:left="0" w:firstLine="0"/>
+      </w:pPr>
+    </w:p>
+    <w:p>
+      <w:pPr>
+        <w:spacing w:after="407" w:line="360" w:lineRule="auto"/>
+        <w:ind w:left="-5" w:right="-15"/>
+        <w:rPr>
+          <w:rStyle w:val="Heading1Char"/>
+          <w:rFonts w:ascii="Times New Roman" w:hAnsi="Times New Roman" w:cs="Times New Roman"/>
+          <w:b/>
+        </w:rPr>
+      </w:pPr>
+      <w:bookmarkStart w:id="6" w:name="_Toc223968947"/>
+      <w:r>
+        <w:rPr>
+          <w:rStyle w:val="Heading1Char"/>
+          <w:rFonts w:ascii="Times New Roman" w:hAnsi="Times New Roman" w:cs="Times New Roman"/>
+          <w:b/>
+        </w:rPr>
+        <w:t>EXPLANATION TEXT (1–2 SENTENCES EACH)</w:t>
+      </w:r>
+      <w:bookmarkEnd w:id="6"/>
+      <w:r>
+        <w:rPr>
+          <w:rStyle w:val="Heading1Char"/>
+          <w:rFonts w:ascii="Times New Roman" w:hAnsi="Times New Roman" w:cs="Times New Roman"/>
+          <w:b/>
+        </w:rPr>
+        <w:t xml:space="preserve"> </w:t>
+      </w:r>
+    </w:p>
+    <w:p>
+      <w:pPr>
+        <w:pStyle w:val="ListParagraph"/>
+        <w:numPr>
+          <w:ilvl w:val="0"/>
+          <w:numId w:val="32"/>
+        </w:numPr>
+        <w:spacing w:line="360" w:lineRule="auto"/>
+      </w:pPr>
+      <w:r>
+        <w:rPr>
+          <w:rStyle w:val="Strong"/>
+          <w:rFonts w:eastAsia="Arial"/>
+        </w:rPr>
+        <w:t>airplane_mode_enabled</w:t>
+      </w:r>
+      <w:r>
+        <w:rPr>
+          <w:rStyle w:val="Strong"/>
+          <w:rFonts w:eastAsia="Arial"/>
+          <w:lang w:val="en-US"/>
+        </w:rPr>
+        <w:t xml:space="preserve">:  </w:t>
+      </w:r>
+      <w:r>
+        <w:t>Airplane Mode disables wireless radios, including Wi-Fi, so the laptop cannot connect until it is turned off.</w:t>
+      </w:r>
+    </w:p>
+    <w:p>
+      <w:pPr>
+        <w:spacing w:line="360" w:lineRule="auto"/>
+        <w:ind w:left="345" w:firstLine="0"/>
+      </w:pPr>
+    </w:p>
+    <w:p>
+      <w:pPr>
+        <w:pStyle w:val="ListParagraph"/>
+        <w:numPr>
+          <w:ilvl w:val="0"/>
+          <w:numId w:val="32"/>
+        </w:numPr>
+        <w:spacing w:after="333" w:line="360" w:lineRule="auto"/>
+        <w:ind w:right="-15"/>
+        <w:rPr>
+          <w:rFonts w:eastAsia="Arial"/>
+          <w:b/>
+          <w:bCs/>
+        </w:rPr>
+      </w:pPr>
+      <w:r>
+        <w:rPr>
+          <w:rStyle w:val="Strong"/>
+          <w:rFonts w:eastAsia="Arial"/>
+        </w:rPr>
+        <w:t>wifi_disabled</w:t>
+      </w:r>
+      <w:r>
+        <w:rPr>
+          <w:rStyle w:val="Strong"/>
+          <w:rFonts w:eastAsia="Arial"/>
+          <w:lang w:val="en-US"/>
+        </w:rPr>
+        <w:t xml:space="preserve">: </w:t>
+      </w:r>
+      <w:r>
+        <w:t>Wi-Fi is turned off on the laptop, preventing it from scanning and connecting to networks.</w:t>
+      </w:r>
+    </w:p>
+    <w:p>
+      <w:pPr>
+        <w:pStyle w:val="ListParagraph"/>
+        <w:spacing w:line="360" w:lineRule="auto"/>
+        <w:rPr>
+          <w:rFonts w:eastAsia="Arial"/>
+          <w:b/>
+          <w:bCs/>
+        </w:rPr>
+      </w:pPr>
+    </w:p>
+    <w:p>
+      <w:pPr>
+        <w:pStyle w:val="ListParagraph"/>
+        <w:spacing w:after="333" w:line="360" w:lineRule="auto"/>
+        <w:ind w:left="705" w:right="-15" w:firstLine="0"/>
+        <w:rPr>
+          <w:rFonts w:eastAsia="Arial"/>
+          <w:b/>
+          <w:bCs/>
+        </w:rPr>
+      </w:pPr>
+    </w:p>
+    <w:p>
+      <w:pPr>
+        <w:pStyle w:val="ListParagraph"/>
+        <w:numPr>
+          <w:ilvl w:val="0"/>
+          <w:numId w:val="32"/>
+        </w:numPr>
+        <w:spacing w:line="360" w:lineRule="auto"/>
+      </w:pPr>
+      <w:r>
+        <w:rPr>
+          <w:rStyle w:val="Strong"/>
+          <w:rFonts w:eastAsia="Arial"/>
+        </w:rPr>
+        <w:t>adapter_or_driver_issue</w:t>
+      </w:r>
+      <w:r>
+        <w:rPr>
+          <w:rStyle w:val="Strong"/>
+          <w:rFonts w:eastAsia="Arial"/>
+          <w:lang w:val="en-US"/>
+        </w:rPr>
+        <w:t xml:space="preserve">: </w:t>
+      </w:r>
+      <w:r>
+        <w:t>Wi-Fi is enabled and Airplane Mode is off, but no networks are visible, indicating the adapter may be disabled, malfunctioning, or the driver is faulty.</w:t>
+      </w:r>
+    </w:p>
+    <w:p>
+      <w:pPr>
+        <w:spacing w:line="360" w:lineRule="auto"/>
+        <w:rPr>
+          <w:rStyle w:val="Strong"/>
+          <w:b w:val="0"/>
+          <w:bCs w:val="0"/>
+        </w:rPr>
+      </w:pPr>
+    </w:p>
+    <w:p>
+      <w:pPr>
+        <w:pStyle w:val="ListParagraph"/>
+        <w:numPr>
+          <w:ilvl w:val="0"/>
+          <w:numId w:val="32"/>
+        </w:numPr>
+        <w:spacing w:line="360" w:lineRule="auto"/>
+      </w:pPr>
+      <w:r>
+        <w:rPr>
+          <w:rStyle w:val="Strong"/>
+          <w:rFonts w:eastAsia="Arial"/>
+        </w:rPr>
+        <w:t>password_or_profile_issue</w:t>
+      </w:r>
+      <w:r>
+        <w:rPr>
+          <w:rStyle w:val="Strong"/>
+          <w:rFonts w:eastAsia="Arial"/>
+          <w:lang w:val="en-US"/>
+        </w:rPr>
+        <w:t xml:space="preserve">: </w:t>
+      </w:r>
+      <w:r>
+        <w:t>The laptop sees networks but cannot connect while other devices can, suggesting incorrect credentials or a corrupted saved Wi-Fi profile.</w:t>
+      </w:r>
+    </w:p>
+    <w:p>
+      <w:pPr>
+        <w:spacing w:line="360" w:lineRule="auto"/>
+      </w:pPr>
+    </w:p>
+    <w:p>
+      <w:pPr>
+        <w:pStyle w:val="ListParagraph"/>
+        <w:numPr>
+          <w:ilvl w:val="0"/>
+          <w:numId w:val="32"/>
+        </w:numPr>
+        <w:spacing w:line="360" w:lineRule="auto"/>
+      </w:pPr>
+      <w:r>
+        <w:rPr>
+          <w:rStyle w:val="Strong"/>
+          <w:rFonts w:eastAsia="Arial"/>
+        </w:rPr>
+        <w:t>dns_or_ip_stack_issue</w:t>
+      </w:r>
+      <w:r>
+        <w:rPr>
+          <w:rStyle w:val="Strong"/>
+          <w:rFonts w:eastAsia="Arial"/>
+          <w:lang w:val="en-US"/>
+        </w:rPr>
+        <w:t xml:space="preserve">: </w:t>
+      </w:r>
+      <w:r>
+        <w:t>The laptop is connected to Wi-Fi but has no internet while other devices do, indicating a DNS or IP configuration problem on the laptop.</w:t>
+      </w:r>
+    </w:p>
+    <w:p>
+      <w:pPr>
+        <w:spacing w:line="360" w:lineRule="auto"/>
+        <w:ind w:left="345" w:firstLine="0"/>
+        <w:rPr>
+          <w:rStyle w:val="Strong"/>
+          <w:b w:val="0"/>
+          <w:bCs w:val="0"/>
+        </w:rPr>
+      </w:pPr>
+    </w:p>
+    <w:p>
+      <w:pPr>
+        <w:pStyle w:val="ListParagraph"/>
+        <w:numPr>
+          <w:ilvl w:val="0"/>
+          <w:numId w:val="32"/>
+        </w:numPr>
+        <w:spacing w:after="280" w:line="360" w:lineRule="auto"/>
+      </w:pPr>
+      <w:r>
+        <w:rPr>
+          <w:rStyle w:val="Strong"/>
+          <w:rFonts w:eastAsia="Arial"/>
+        </w:rPr>
+        <w:lastRenderedPageBreak/>
+        <w:t>router_or_isp_problem</w:t>
+      </w:r>
+      <w:r>
+        <w:rPr>
+          <w:rStyle w:val="Strong"/>
+          <w:rFonts w:eastAsia="Arial"/>
+          <w:lang w:val="en-US"/>
+        </w:rPr>
+        <w:t xml:space="preserve">: </w:t>
+      </w:r>
+      <w:r>
+        <w:t>If multiple devices cannot connect or cannot access the internet, the issue is likely with the router or the ISP rather than the laptop.</w:t>
+      </w:r>
+    </w:p>
+    <w:p>
+      <w:pPr>
+        <w:spacing w:after="333" w:line="360" w:lineRule="auto"/>
+        <w:ind w:right="-15"/>
+        <w:rPr>
+          <w:rStyle w:val="Strong"/>
+          <w:rFonts w:eastAsia="Arial"/>
+          <w:lang w:val="en-US"/>
+        </w:rPr>
+      </w:pPr>
+    </w:p>
+    <w:p>
+      <w:pPr>
+        <w:spacing w:after="407" w:line="360" w:lineRule="auto"/>
+        <w:ind w:left="0" w:right="-15" w:firstLine="0"/>
+      </w:pPr>
+    </w:p>
+    <w:p>
+      <w:pPr>
+        <w:spacing w:after="407" w:line="360" w:lineRule="auto"/>
+        <w:ind w:left="0" w:right="-15" w:firstLine="0"/>
+        <w:rPr>
+          <w:rStyle w:val="Heading1Char"/>
+          <w:rFonts w:ascii="Times New Roman" w:hAnsi="Times New Roman" w:cs="Times New Roman"/>
+          <w:b/>
+        </w:rPr>
+      </w:pPr>
+      <w:bookmarkStart w:id="7" w:name="_Toc223968948"/>
+      <w:r>
+        <w:rPr>
+          <w:rStyle w:val="Heading1Char"/>
+          <w:rFonts w:ascii="Times New Roman" w:hAnsi="Times New Roman" w:cs="Times New Roman"/>
+          <w:b/>
+        </w:rPr>
+        <w:t>TEST CASES</w:t>
+      </w:r>
+      <w:bookmarkEnd w:id="7"/>
+      <w:r>
+        <w:rPr>
+          <w:rStyle w:val="Heading1Char"/>
+          <w:rFonts w:ascii="Times New Roman" w:hAnsi="Times New Roman" w:cs="Times New Roman"/>
+          <w:b/>
+        </w:rPr>
+        <w:t xml:space="preserve"> </w:t>
+      </w:r>
+    </w:p>
+    <w:p>
+      <w:pPr>
+        <w:spacing w:after="427" w:line="360" w:lineRule="auto"/>
+        <w:jc w:val="both"/>
+        <w:rPr>
+          <w:lang w:val="en-US"/>
+        </w:rPr>
+      </w:pPr>
+      <w:r>
+        <w:t>The system was tested using several WiFi troubleshooting scenarios. Different combinations of symptoms were used to verify that the system produces the correct diagnosis. These test cases ensured that the inference engine correctly maps symptoms to conclusions.</w:t>
+      </w:r>
+      <w:r>
+        <w:rPr>
+          <w:lang w:val="en-US"/>
+        </w:rPr>
+        <w:t xml:space="preserve"> </w:t>
+      </w:r>
+      <w:r>
+        <w:t>We u</w:t>
+      </w:r>
+      <w:r>
+        <w:t>se these for quick validation. (Inputs not listed can be “don’t care”,</w:t>
+      </w:r>
+      <w:r>
+        <w:t xml:space="preserve"> but giving full inputs helps</w:t>
+      </w:r>
+      <w:r>
+        <w:rPr>
+          <w:lang w:val="en-US"/>
+        </w:rPr>
+        <w:t>)</w:t>
+      </w:r>
+      <w:r>
+        <w:t>.</w:t>
+      </w:r>
+    </w:p>
+    <w:p>
+      <w:pPr>
+        <w:spacing w:after="427" w:line="360" w:lineRule="auto"/>
+        <w:ind w:left="345" w:firstLine="0"/>
+        <w:jc w:val="both"/>
+      </w:pPr>
+    </w:p>
+    <w:tbl>
+      <w:tblPr>
+        <w:tblStyle w:val="TableGrid0"/>
+        <w:tblW w:w="8789" w:type="dxa"/>
+        <w:tblInd w:w="-289" w:type="dxa"/>
+        <w:tblLook w:val="04A0" w:firstRow="1" w:lastRow="0" w:firstColumn="1" w:lastColumn="0" w:noHBand="0" w:noVBand="1"/>
+      </w:tblPr>
+      <w:tblGrid>
+        <w:gridCol w:w="2978"/>
+        <w:gridCol w:w="2693"/>
+        <w:gridCol w:w="3118"/>
+      </w:tblGrid>
+      <w:tr>
+        <w:tc>
+          <w:tcPr>
+            <w:tcW w:w="2978" w:type="dxa"/>
+          </w:tcPr>
+          <w:p>
+            <w:pPr>
+              <w:spacing w:after="326" w:line="360" w:lineRule="auto"/>
+              <w:ind w:left="0" w:firstLine="0"/>
+              <w:jc w:val="center"/>
+              <w:rPr>
+                <w:b/>
+                <w:lang w:val="en-US"/>
+              </w:rPr>
+            </w:pPr>
+            <w:r>
+              <w:rPr>
+                <w:b/>
+                <w:lang w:val="en-US"/>
+              </w:rPr>
+              <w:t>TEST CASE ID</w:t>
+            </w:r>
+          </w:p>
+        </w:tc>
+        <w:tc>
+          <w:tcPr>
+            <w:tcW w:w="2693" w:type="dxa"/>
+          </w:tcPr>
+          <w:p>
+            <w:pPr>
+              <w:spacing w:after="326" w:line="360" w:lineRule="auto"/>
+              <w:ind w:left="0" w:firstLine="0"/>
+              <w:jc w:val="center"/>
+              <w:rPr>
+                <w:b/>
+                <w:lang w:val="en-US"/>
+              </w:rPr>
+            </w:pPr>
+            <w:r>
+              <w:rPr>
+                <w:b/>
+                <w:lang w:val="en-US"/>
+              </w:rPr>
+              <w:t>TEST CASE</w:t>
+            </w:r>
+          </w:p>
+        </w:tc>
+        <w:tc>
+          <w:tcPr>
+            <w:tcW w:w="3118" w:type="dxa"/>
+          </w:tcPr>
+          <w:p>
+            <w:pPr>
+              <w:spacing w:after="326" w:line="360" w:lineRule="auto"/>
+              <w:ind w:left="0" w:firstLine="0"/>
+              <w:jc w:val="center"/>
+              <w:rPr>
+                <w:b/>
+                <w:lang w:val="en-US"/>
+              </w:rPr>
+            </w:pPr>
+            <w:r>
+              <w:rPr>
+                <w:b/>
+                <w:lang w:val="en-US"/>
+              </w:rPr>
+              <w:t>EXPECTED OUTCOME</w:t>
+            </w:r>
+          </w:p>
+        </w:tc>
+      </w:tr>
+      <w:tr>
+        <w:trPr>
+          <w:trHeight w:val="631"/>
+        </w:trPr>
+        <w:tc>
+          <w:tcPr>
+            <w:tcW w:w="2978" w:type="dxa"/>
+          </w:tcPr>
+          <w:p>
+            <w:pPr>
+              <w:rPr>
+                <w:b/>
+              </w:rPr>
+            </w:pPr>
+            <w:r>
+              <w:rPr>
+                <w:rFonts w:eastAsia="Arial"/>
+                <w:b/>
+              </w:rPr>
+              <w:t xml:space="preserve">TC1 — Airplane Mode </w:t>
+            </w:r>
+          </w:p>
+          <w:p>
+            <w:pPr>
+              <w:spacing w:after="326" w:line="360" w:lineRule="auto"/>
+              <w:ind w:left="0" w:firstLine="0"/>
+              <w:rPr>
+                <w:lang w:val="en-US"/>
+              </w:rPr>
+            </w:pPr>
+          </w:p>
+        </w:tc>
+        <w:tc>
+          <w:tcPr>
+            <w:tcW w:w="2693" w:type="dxa"/>
+          </w:tcPr>
+          <w:p>
+            <w:pPr>
+              <w:spacing w:after="326" w:line="360" w:lineRule="auto"/>
+              <w:ind w:left="0" w:firstLine="0"/>
+            </w:pPr>
+            <w:r>
+              <w:t>airplane_mode</w:t>
+            </w:r>
+            <w:r>
+              <w:rPr>
+                <w:lang w:val="en-US"/>
+              </w:rPr>
+              <w:t xml:space="preserve"> </w:t>
+            </w:r>
+            <w:r>
+              <w:t>=</w:t>
+            </w:r>
+            <w:r>
+              <w:rPr>
+                <w:lang w:val="en-US"/>
+              </w:rPr>
+              <w:t xml:space="preserve"> </w:t>
+            </w:r>
+            <w:r>
+              <w:t>yes</w:t>
+            </w:r>
+          </w:p>
+        </w:tc>
+        <w:tc>
+          <w:tcPr>
+            <w:tcW w:w="3118" w:type="dxa"/>
+          </w:tcPr>
+          <w:p>
+            <w:pPr>
+              <w:spacing w:after="326" w:line="360" w:lineRule="auto"/>
+              <w:ind w:left="0" w:firstLine="0"/>
+            </w:pPr>
+            <w:r>
+              <w:t>airplane_mode_enabled</w:t>
+            </w:r>
+          </w:p>
+        </w:tc>
+      </w:tr>
+      <w:tr>
+        <w:trPr>
+          <w:trHeight w:val="1114"/>
+        </w:trPr>
+        <w:tc>
+          <w:tcPr>
+            <w:tcW w:w="2978" w:type="dxa"/>
+          </w:tcPr>
+          <w:p>
+            <w:pPr>
+              <w:rPr>
+                <w:rFonts w:eastAsia="Arial"/>
+                <w:b/>
+              </w:rPr>
+            </w:pPr>
+            <w:r>
+              <w:rPr>
+                <w:rFonts w:eastAsia="Arial"/>
+                <w:b/>
+              </w:rPr>
+              <w:t xml:space="preserve">TC2 — Wi-Fi Disabled </w:t>
+            </w:r>
+          </w:p>
+          <w:p>
+            <w:pPr>
+              <w:spacing w:after="326" w:line="360" w:lineRule="auto"/>
+              <w:ind w:left="0" w:firstLine="0"/>
+            </w:pPr>
+          </w:p>
+        </w:tc>
+        <w:tc>
+          <w:tcPr>
+            <w:tcW w:w="2693" w:type="dxa"/>
+          </w:tcPr>
+          <w:p>
+            <w:pPr>
+              <w:ind w:left="0" w:firstLine="0"/>
+            </w:pPr>
+            <w:r>
+              <w:t>airplane_mode</w:t>
+            </w:r>
+            <w:r>
+              <w:rPr>
+                <w:lang w:val="en-US"/>
+              </w:rPr>
+              <w:t xml:space="preserve"> </w:t>
+            </w:r>
+            <w:r>
+              <w:t>=</w:t>
+            </w:r>
+            <w:r>
+              <w:rPr>
+                <w:lang w:val="en-US"/>
+              </w:rPr>
+              <w:t xml:space="preserve"> </w:t>
+            </w:r>
+            <w:r>
+              <w:t xml:space="preserve">no </w:t>
+            </w:r>
+          </w:p>
+          <w:p>
+            <w:pPr>
+              <w:ind w:left="0" w:firstLine="0"/>
+            </w:pPr>
+            <w:r>
+              <w:t>Wifi_enabled</w:t>
+            </w:r>
+            <w:r>
+              <w:rPr>
+                <w:lang w:val="en-US"/>
+              </w:rPr>
+              <w:t xml:space="preserve"> </w:t>
+            </w:r>
+            <w:r>
+              <w:t>=</w:t>
+            </w:r>
+            <w:r>
+              <w:rPr>
+                <w:lang w:val="en-US"/>
+              </w:rPr>
+              <w:t xml:space="preserve"> </w:t>
+            </w:r>
+            <w:r>
+              <w:t>no</w:t>
+            </w:r>
+            <w:r>
+              <w:rPr>
+                <w:rFonts w:eastAsia="Arial"/>
+              </w:rPr>
+              <w:t xml:space="preserve"> </w:t>
+            </w:r>
+            <w:r>
+              <w:t xml:space="preserve"> </w:t>
+            </w:r>
+          </w:p>
+          <w:p>
+            <w:pPr>
+              <w:spacing w:after="326" w:line="360" w:lineRule="auto"/>
+              <w:ind w:left="0" w:firstLine="0"/>
+            </w:pPr>
+          </w:p>
+        </w:tc>
+        <w:tc>
+          <w:tcPr>
+            <w:tcW w:w="3118" w:type="dxa"/>
+          </w:tcPr>
+          <w:p>
+            <w:pPr>
+              <w:spacing w:after="326" w:line="360" w:lineRule="auto"/>
+              <w:ind w:left="0" w:firstLine="0"/>
+            </w:pPr>
+            <w:r>
+              <w:t>wifi_disabled</w:t>
+            </w:r>
+          </w:p>
+        </w:tc>
+      </w:tr>
+      <w:tr>
+        <w:trPr>
+          <w:trHeight w:val="979"/>
+        </w:trPr>
+        <w:tc>
+          <w:tcPr>
+            <w:tcW w:w="2978" w:type="dxa"/>
+          </w:tcPr>
+          <w:p>
+            <w:pPr>
+              <w:rPr>
+                <w:rFonts w:eastAsia="Arial"/>
+                <w:b/>
+              </w:rPr>
+            </w:pPr>
+            <w:r>
+              <w:rPr>
+                <w:rFonts w:eastAsia="Arial"/>
+                <w:b/>
+              </w:rPr>
+              <w:t xml:space="preserve">TC3 — Adapter/Driver Issue </w:t>
+            </w:r>
+          </w:p>
+          <w:p>
+            <w:pPr>
+              <w:spacing w:after="326" w:line="360" w:lineRule="auto"/>
+              <w:ind w:left="0" w:firstLine="0"/>
+            </w:pPr>
+          </w:p>
+        </w:tc>
+        <w:tc>
+          <w:tcPr>
+            <w:tcW w:w="2693" w:type="dxa"/>
+          </w:tcPr>
+          <w:p>
+            <w:pPr>
+              <w:ind w:left="0" w:firstLine="0"/>
+            </w:pPr>
+            <w:r>
+              <w:t>airplane_mode</w:t>
+            </w:r>
+            <w:r>
+              <w:rPr>
+                <w:lang w:val="en-US"/>
+              </w:rPr>
+              <w:t xml:space="preserve"> </w:t>
+            </w:r>
+            <w:r>
+              <w:t>=</w:t>
+            </w:r>
+            <w:r>
+              <w:rPr>
+                <w:lang w:val="en-US"/>
+              </w:rPr>
+              <w:t xml:space="preserve"> </w:t>
+            </w:r>
+            <w:r>
+              <w:t xml:space="preserve">no </w:t>
+            </w:r>
+          </w:p>
+          <w:p>
+            <w:pPr>
+              <w:ind w:left="0" w:firstLine="0"/>
+            </w:pPr>
+            <w:r>
+              <w:t>wifi_enabled</w:t>
+            </w:r>
+            <w:r>
+              <w:rPr>
+                <w:lang w:val="en-US"/>
+              </w:rPr>
+              <w:t xml:space="preserve"> </w:t>
+            </w:r>
+            <w:r>
+              <w:t>=</w:t>
+            </w:r>
+            <w:r>
+              <w:rPr>
+                <w:lang w:val="en-US"/>
+              </w:rPr>
+              <w:t xml:space="preserve"> </w:t>
+            </w:r>
+            <w:r>
+              <w:t xml:space="preserve">yes </w:t>
+            </w:r>
+          </w:p>
+          <w:p>
+            <w:pPr>
+              <w:ind w:left="0" w:firstLine="0"/>
+            </w:pPr>
+            <w:r>
+              <w:t>sees_networks</w:t>
+            </w:r>
+            <w:r>
+              <w:rPr>
+                <w:lang w:val="en-US"/>
+              </w:rPr>
+              <w:t xml:space="preserve"> </w:t>
+            </w:r>
+            <w:r>
+              <w:t>=</w:t>
+            </w:r>
+            <w:r>
+              <w:rPr>
+                <w:lang w:val="en-US"/>
+              </w:rPr>
+              <w:t xml:space="preserve"> </w:t>
+            </w:r>
+            <w:r>
+              <w:t>no</w:t>
+            </w:r>
+          </w:p>
+          <w:p>
+            <w:pPr>
+              <w:spacing w:after="326" w:line="360" w:lineRule="auto"/>
+              <w:ind w:left="0" w:firstLine="0"/>
+            </w:pPr>
+          </w:p>
+        </w:tc>
+        <w:tc>
+          <w:tcPr>
+            <w:tcW w:w="3118" w:type="dxa"/>
+          </w:tcPr>
+          <w:p>
+            <w:pPr>
+              <w:spacing w:after="326" w:line="360" w:lineRule="auto"/>
+              <w:ind w:left="0" w:firstLine="0"/>
+            </w:pPr>
+            <w:r>
+              <w:t>adapter_or_driver_issue</w:t>
+            </w:r>
+          </w:p>
+        </w:tc>
+      </w:tr>
+      <w:tr>
+        <w:trPr>
+          <w:trHeight w:val="1770"/>
+        </w:trPr>
+        <w:tc>
+          <w:tcPr>
+            <w:tcW w:w="2978" w:type="dxa"/>
+          </w:tcPr>
+          <w:p/>
+          <w:p>
+            <w:pPr>
+              <w:rPr>
+                <w:rFonts w:eastAsia="Arial"/>
+                <w:b/>
+              </w:rPr>
+            </w:pPr>
+            <w:r>
+              <w:rPr>
+                <w:rFonts w:eastAsia="Arial"/>
+                <w:b/>
+              </w:rPr>
+              <w:t xml:space="preserve">TC4 — Password/Profile Issue </w:t>
+            </w:r>
+          </w:p>
+          <w:p>
+            <w:pPr>
+              <w:spacing w:after="326" w:line="360" w:lineRule="auto"/>
+              <w:ind w:left="0" w:firstLine="0"/>
+            </w:pPr>
+          </w:p>
+        </w:tc>
+        <w:tc>
+          <w:tcPr>
+            <w:tcW w:w="2693" w:type="dxa"/>
+          </w:tcPr>
+          <w:p>
+            <w:pPr>
+              <w:ind w:left="0" w:firstLine="0"/>
+            </w:pPr>
+            <w:r>
+              <w:t>airplane_mode</w:t>
+            </w:r>
+            <w:r>
+              <w:rPr>
+                <w:lang w:val="en-US"/>
+              </w:rPr>
+              <w:t xml:space="preserve"> </w:t>
+            </w:r>
+            <w:r>
+              <w:t>=</w:t>
+            </w:r>
+            <w:r>
+              <w:rPr>
+                <w:lang w:val="en-US"/>
+              </w:rPr>
+              <w:t xml:space="preserve"> </w:t>
+            </w:r>
+            <w:r>
+              <w:t xml:space="preserve">no </w:t>
+            </w:r>
+          </w:p>
+          <w:p>
+            <w:pPr>
+              <w:ind w:left="0" w:firstLine="0"/>
+            </w:pPr>
+            <w:r>
+              <w:t>wifi_enabled</w:t>
+            </w:r>
+            <w:r>
+              <w:rPr>
+                <w:lang w:val="en-US"/>
+              </w:rPr>
+              <w:t xml:space="preserve"> </w:t>
+            </w:r>
+            <w:r>
+              <w:t>=</w:t>
+            </w:r>
+            <w:r>
+              <w:rPr>
+                <w:lang w:val="en-US"/>
+              </w:rPr>
+              <w:t xml:space="preserve"> </w:t>
+            </w:r>
+            <w:r>
+              <w:t xml:space="preserve">yes </w:t>
+            </w:r>
+          </w:p>
+          <w:p>
+            <w:pPr>
+              <w:ind w:left="0" w:firstLine="0"/>
+            </w:pPr>
+            <w:r>
+              <w:t>sees_networks</w:t>
+            </w:r>
+            <w:r>
+              <w:rPr>
+                <w:lang w:val="en-US"/>
+              </w:rPr>
+              <w:t xml:space="preserve"> </w:t>
+            </w:r>
+            <w:r>
+              <w:t>=</w:t>
+            </w:r>
+            <w:r>
+              <w:rPr>
+                <w:lang w:val="en-US"/>
+              </w:rPr>
+              <w:t xml:space="preserve"> </w:t>
+            </w:r>
+            <w:r>
+              <w:t xml:space="preserve">yes </w:t>
+            </w:r>
+          </w:p>
+          <w:p>
+            <w:pPr>
+              <w:ind w:left="0" w:firstLine="0"/>
+            </w:pPr>
+            <w:r>
+              <w:t>can_connect</w:t>
+            </w:r>
+            <w:r>
+              <w:rPr>
+                <w:lang w:val="en-US"/>
+              </w:rPr>
+              <w:t xml:space="preserve"> </w:t>
+            </w:r>
+            <w:r>
+              <w:t>=</w:t>
+            </w:r>
+            <w:r>
+              <w:rPr>
+                <w:lang w:val="en-US"/>
+              </w:rPr>
+              <w:t xml:space="preserve"> </w:t>
+            </w:r>
+            <w:r>
+              <w:t xml:space="preserve">no </w:t>
+            </w:r>
+          </w:p>
+          <w:p>
+            <w:pPr>
+              <w:ind w:left="0" w:firstLine="0"/>
+            </w:pPr>
+            <w:r>
+              <w:t>other_devices_connect</w:t>
+            </w:r>
+            <w:r>
+              <w:rPr>
+                <w:lang w:val="en-US"/>
+              </w:rPr>
+              <w:t xml:space="preserve"> </w:t>
+            </w:r>
+            <w:r>
+              <w:t>=</w:t>
+            </w:r>
+            <w:r>
+              <w:rPr>
+                <w:lang w:val="en-US"/>
+              </w:rPr>
+              <w:t xml:space="preserve"> </w:t>
+            </w:r>
+            <w:r>
+              <w:t>yes</w:t>
+            </w:r>
+            <w:r>
+              <w:rPr>
+                <w:rFonts w:eastAsia="Arial"/>
+              </w:rPr>
+              <w:t xml:space="preserve"> </w:t>
+            </w:r>
+          </w:p>
+          <w:p>
+            <w:pPr>
+              <w:spacing w:after="326" w:line="360" w:lineRule="auto"/>
+              <w:ind w:left="0" w:firstLine="0"/>
+            </w:pPr>
+          </w:p>
+        </w:tc>
+        <w:tc>
+          <w:tcPr>
+            <w:tcW w:w="3118" w:type="dxa"/>
+          </w:tcPr>
+          <w:p>
+            <w:pPr>
+              <w:spacing w:after="326" w:line="360" w:lineRule="auto"/>
+              <w:ind w:left="0" w:firstLine="0"/>
+            </w:pPr>
+            <w:r>
+              <w:t>password_or_profile_issue</w:t>
+            </w:r>
+          </w:p>
+        </w:tc>
+      </w:tr>
+      <w:tr>
+        <w:tc>
+          <w:tcPr>
+            <w:tcW w:w="2978" w:type="dxa"/>
+          </w:tcPr>
+          <w:p>
+            <w:pPr>
+              <w:rPr>
+                <w:rFonts w:eastAsia="Arial"/>
+                <w:b/>
+              </w:rPr>
+            </w:pPr>
+            <w:r>
+              <w:rPr>
+                <w:rFonts w:eastAsia="Arial"/>
+                <w:b/>
+              </w:rPr>
+              <w:t xml:space="preserve">TC5 — DNS/IP Stack Issue </w:t>
+            </w:r>
+          </w:p>
+          <w:p>
+            <w:pPr>
+              <w:spacing w:after="326" w:line="360" w:lineRule="auto"/>
+              <w:ind w:left="0" w:firstLine="0"/>
+            </w:pPr>
+          </w:p>
+        </w:tc>
+        <w:tc>
+          <w:tcPr>
+            <w:tcW w:w="2693" w:type="dxa"/>
+          </w:tcPr>
+          <w:p>
+            <w:pPr>
+              <w:ind w:left="0" w:firstLine="0"/>
+            </w:pPr>
+            <w:r>
+              <w:t>connected_to_wifi</w:t>
+            </w:r>
+            <w:r>
+              <w:rPr>
+                <w:lang w:val="en-US"/>
+              </w:rPr>
+              <w:t xml:space="preserve"> </w:t>
+            </w:r>
+            <w:r>
+              <w:t>=</w:t>
+            </w:r>
+            <w:r>
+              <w:rPr>
+                <w:lang w:val="en-US"/>
+              </w:rPr>
+              <w:t xml:space="preserve"> </w:t>
+            </w:r>
+            <w:r>
+              <w:t xml:space="preserve">yes </w:t>
+            </w:r>
+          </w:p>
+          <w:p>
+            <w:pPr>
+              <w:ind w:left="0" w:firstLine="0"/>
+            </w:pPr>
+            <w:r>
+              <w:t>internet_access</w:t>
+            </w:r>
+            <w:r>
+              <w:rPr>
+                <w:lang w:val="en-US"/>
+              </w:rPr>
+              <w:t xml:space="preserve"> </w:t>
+            </w:r>
+            <w:r>
+              <w:t>=</w:t>
+            </w:r>
+            <w:r>
+              <w:rPr>
+                <w:lang w:val="en-US"/>
+              </w:rPr>
+              <w:t xml:space="preserve"> </w:t>
+            </w:r>
+            <w:r>
+              <w:t xml:space="preserve">no </w:t>
+            </w:r>
+          </w:p>
+          <w:p>
+            <w:pPr>
+              <w:ind w:left="0" w:firstLine="0"/>
+            </w:pPr>
+            <w:r>
+              <w:t>other_devices_internet</w:t>
+            </w:r>
+            <w:r>
+              <w:rPr>
+                <w:lang w:val="en-US"/>
+              </w:rPr>
+              <w:t xml:space="preserve"> </w:t>
+            </w:r>
+            <w:r>
+              <w:t>=</w:t>
+            </w:r>
+            <w:r>
+              <w:rPr>
+                <w:lang w:val="en-US"/>
+              </w:rPr>
+              <w:t xml:space="preserve"> </w:t>
+            </w:r>
+            <w:r>
+              <w:t>yes</w:t>
+            </w:r>
+            <w:r>
+              <w:rPr>
+                <w:rFonts w:eastAsia="Arial"/>
+              </w:rPr>
+              <w:t xml:space="preserve"> </w:t>
+            </w:r>
+            <w:r>
+              <w:t xml:space="preserve"> </w:t>
+            </w:r>
+          </w:p>
+          <w:p>
+            <w:pPr>
+              <w:spacing w:after="326" w:line="360" w:lineRule="auto"/>
+              <w:ind w:left="0" w:firstLine="0"/>
+            </w:pPr>
+          </w:p>
+        </w:tc>
+        <w:tc>
+          <w:tcPr>
+            <w:tcW w:w="3118" w:type="dxa"/>
+          </w:tcPr>
+          <w:p>
+            <w:pPr>
+              <w:spacing w:after="326" w:line="360" w:lineRule="auto"/>
+              <w:ind w:left="0" w:firstLine="0"/>
+            </w:pPr>
+            <w:r>
+              <w:t>dns_or_ip_stack_issue</w:t>
+            </w:r>
+          </w:p>
+        </w:tc>
+      </w:tr>
+      <w:tr>
+        <w:tc>
+          <w:tcPr>
+            <w:tcW w:w="2978" w:type="dxa"/>
+          </w:tcPr>
+          <w:p>
+            <w:pPr>
+              <w:rPr>
+                <w:rFonts w:eastAsia="Arial"/>
+                <w:b/>
+              </w:rPr>
+            </w:pPr>
+            <w:r>
+              <w:rPr>
+                <w:rFonts w:eastAsia="Arial"/>
+                <w:b/>
+              </w:rPr>
+              <w:t xml:space="preserve">TC6 — Router/ISP Problem (No one connects) </w:t>
+            </w:r>
+          </w:p>
+          <w:p>
+            <w:pPr>
+              <w:spacing w:after="326" w:line="360" w:lineRule="auto"/>
+              <w:ind w:left="0" w:firstLine="0"/>
+            </w:pPr>
+          </w:p>
+        </w:tc>
+        <w:tc>
+          <w:tcPr>
+            <w:tcW w:w="2693" w:type="dxa"/>
+          </w:tcPr>
+          <w:p>
+            <w:pPr>
+              <w:ind w:left="0" w:firstLine="0"/>
+            </w:pPr>
+            <w:r>
+              <w:t>other_devices_connect</w:t>
+            </w:r>
+            <w:r>
+              <w:rPr>
+                <w:lang w:val="en-US"/>
+              </w:rPr>
+              <w:t xml:space="preserve"> </w:t>
+            </w:r>
+            <w:r>
+              <w:t>=</w:t>
+            </w:r>
+            <w:r>
+              <w:rPr>
+                <w:lang w:val="en-US"/>
+              </w:rPr>
+              <w:t xml:space="preserve"> </w:t>
+            </w:r>
+            <w:r>
+              <w:t>no</w:t>
+            </w:r>
+            <w:r>
+              <w:rPr>
+                <w:rFonts w:eastAsia="Arial"/>
+              </w:rPr>
+              <w:t xml:space="preserve"> </w:t>
+            </w:r>
+            <w:r>
+              <w:t xml:space="preserve"> </w:t>
+            </w:r>
+          </w:p>
+          <w:p>
+            <w:pPr>
+              <w:spacing w:after="326" w:line="360" w:lineRule="auto"/>
+              <w:ind w:left="0" w:firstLine="0"/>
+            </w:pPr>
+          </w:p>
+        </w:tc>
+        <w:tc>
+          <w:tcPr>
+            <w:tcW w:w="3118" w:type="dxa"/>
+          </w:tcPr>
+          <w:p>
+            <w:pPr>
+              <w:spacing w:after="326" w:line="360" w:lineRule="auto"/>
+              <w:ind w:left="0" w:firstLine="0"/>
+            </w:pPr>
+            <w:r>
+              <w:t>router_or_isp_problem</w:t>
+            </w:r>
+          </w:p>
+        </w:tc>
+      </w:tr>
+      <w:tr>
+        <w:tc>
+          <w:tcPr>
+            <w:tcW w:w="2978" w:type="dxa"/>
+          </w:tcPr>
+          <w:p>
+            <w:pPr>
+              <w:rPr>
+                <w:rFonts w:eastAsia="Arial"/>
+                <w:i/>
+              </w:rPr>
+            </w:pPr>
+            <w:r>
+              <w:rPr>
+                <w:rFonts w:eastAsia="Arial"/>
+                <w:i/>
+              </w:rPr>
+              <w:t xml:space="preserve">TC7 — Router/ISP Problem (Connected but no internet for everyone) </w:t>
+            </w:r>
+          </w:p>
+          <w:p>
+            <w:pPr>
+              <w:rPr>
+                <w:rFonts w:eastAsia="Arial"/>
+                <w:i/>
+              </w:rPr>
+            </w:pPr>
+          </w:p>
+          <w:p>
+            <w:pPr>
+              <w:rPr>
+                <w:i/>
+              </w:rPr>
+            </w:pPr>
+            <w:r>
+              <w:rPr>
+                <w:rFonts w:eastAsia="Arial"/>
+                <w:i/>
+              </w:rPr>
+              <w:t>(Optional)</w:t>
+            </w:r>
+          </w:p>
+          <w:p>
+            <w:pPr>
+              <w:rPr>
+                <w:rFonts w:eastAsia="Arial"/>
+                <w:b/>
+                <w:i/>
+              </w:rPr>
+            </w:pPr>
+          </w:p>
+        </w:tc>
+        <w:tc>
+          <w:tcPr>
+            <w:tcW w:w="2693" w:type="dxa"/>
+          </w:tcPr>
+          <w:p>
+            <w:pPr>
+              <w:ind w:left="0" w:firstLine="0"/>
+              <w:rPr>
+                <w:i/>
+              </w:rPr>
+            </w:pPr>
+            <w:r>
+              <w:rPr>
+                <w:i/>
+              </w:rPr>
+              <w:t>other_devices_connect</w:t>
+            </w:r>
+            <w:r>
+              <w:rPr>
+                <w:i/>
+                <w:lang w:val="en-US"/>
+              </w:rPr>
+              <w:t xml:space="preserve"> </w:t>
+            </w:r>
+            <w:r>
+              <w:rPr>
+                <w:i/>
+              </w:rPr>
+              <w:t>=</w:t>
+            </w:r>
+            <w:r>
+              <w:rPr>
+                <w:i/>
+                <w:lang w:val="en-US"/>
+              </w:rPr>
+              <w:t xml:space="preserve"> </w:t>
+            </w:r>
+            <w:r>
+              <w:rPr>
+                <w:i/>
+              </w:rPr>
+              <w:t xml:space="preserve">yes </w:t>
+            </w:r>
+          </w:p>
+          <w:p>
+            <w:pPr>
+              <w:ind w:left="0" w:firstLine="0"/>
+              <w:rPr>
+                <w:i/>
+              </w:rPr>
+            </w:pPr>
+            <w:r>
+              <w:rPr>
+                <w:i/>
+              </w:rPr>
+              <w:t>other_devices_internet</w:t>
+            </w:r>
+            <w:r>
+              <w:rPr>
+                <w:i/>
+                <w:lang w:val="en-US"/>
+              </w:rPr>
+              <w:t xml:space="preserve"> </w:t>
+            </w:r>
+            <w:r>
+              <w:rPr>
+                <w:i/>
+              </w:rPr>
+              <w:t>=</w:t>
+            </w:r>
+            <w:r>
+              <w:rPr>
+                <w:i/>
+                <w:lang w:val="en-US"/>
+              </w:rPr>
+              <w:t xml:space="preserve"> </w:t>
+            </w:r>
+            <w:r>
+              <w:rPr>
+                <w:i/>
+              </w:rPr>
+              <w:t>no</w:t>
+            </w:r>
+            <w:r>
+              <w:rPr>
+                <w:rFonts w:eastAsia="Arial"/>
+                <w:i/>
+              </w:rPr>
+              <w:t xml:space="preserve"> </w:t>
+            </w:r>
+          </w:p>
+          <w:p>
+            <w:pPr>
+              <w:ind w:left="0" w:firstLine="0"/>
+            </w:pPr>
+          </w:p>
+        </w:tc>
+        <w:tc>
+          <w:tcPr>
+            <w:tcW w:w="3118" w:type="dxa"/>
+          </w:tcPr>
+          <w:p>
+            <w:pPr>
+              <w:spacing w:after="326" w:line="360" w:lineRule="auto"/>
+              <w:ind w:left="0" w:firstLine="0"/>
+              <w:rPr>
+                <w:i/>
+              </w:rPr>
+            </w:pPr>
+            <w:r>
+              <w:rPr>
+                <w:i/>
+              </w:rPr>
+              <w:t>router_or_isp_problem</w:t>
+            </w:r>
+          </w:p>
+        </w:tc>
+      </w:tr>
+    </w:tbl>
+    <w:p>
+      <w:pPr>
+        <w:ind w:left="0" w:firstLine="0"/>
+      </w:pPr>
+    </w:p>
+    <w:p/>
+    <w:p>
+      <w:pPr>
+        <w:spacing w:after="204" w:line="360" w:lineRule="auto"/>
+        <w:ind w:left="0" w:firstLine="0"/>
+      </w:pPr>
+    </w:p>
+    <w:p>
+      <w:pPr>
+        <w:spacing w:after="0" w:line="360" w:lineRule="auto"/>
+        <w:ind w:left="0" w:firstLine="0"/>
+        <w:rPr>
+          <w:rFonts w:eastAsia="Arial"/>
+        </w:rPr>
+      </w:pPr>
+      <w:r>
+        <w:rPr>
+          <w:rFonts w:eastAsia="Arial"/>
+        </w:rPr>
+        <w:t xml:space="preserve"> </w:t>
+      </w:r>
+    </w:p>
+    <w:p>
+      <w:pPr>
+        <w:spacing w:after="0" w:line="360" w:lineRule="auto"/>
+        <w:ind w:left="0" w:firstLine="0"/>
+        <w:rPr>
+          <w:rFonts w:eastAsia="Arial"/>
+        </w:rPr>
+      </w:pPr>
+    </w:p>
+    <w:p>
+      <w:pPr>
+        <w:pStyle w:val="Heading3"/>
+        <w:spacing w:line="480" w:lineRule="auto"/>
+        <w:rPr>
+          <w:rFonts w:ascii="Times New Roman" w:hAnsi="Times New Roman" w:cs="Times New Roman"/>
+        </w:rPr>
+      </w:pPr>
+      <w:bookmarkStart w:id="8" w:name="_Toc223968949"/>
+      <w:r>
+        <w:rPr>
+          <w:rStyle w:val="Heading1Char"/>
+          <w:rFonts w:ascii="Times New Roman" w:hAnsi="Times New Roman" w:cs="Times New Roman"/>
+          <w:b/>
+        </w:rPr>
+        <w:t>CONCLUSION</w:t>
+      </w:r>
+      <w:bookmarkEnd w:id="8"/>
+    </w:p>
+    <w:p>
+      <w:pPr>
+        <w:spacing w:line="480" w:lineRule="auto"/>
+      </w:pPr>
+      <w:r>
+        <w:t xml:space="preserve">The knowledge engineering process allowed the team to convert common WiFi troubleshooting knowledge into a rule‑based expert system. By representing the </w:t>
+      </w:r>
+      <w:r>
+        <w:lastRenderedPageBreak/>
+        <w:t>troubleshooting logic as rules in Prolog and connecting it to a Python interface, the system can analyze user symptoms and provide appropriate advice.</w:t>
+      </w:r>
+    </w:p>
+    <w:p>
+      <w:pPr>
+        <w:pStyle w:val="Heading3"/>
+        <w:spacing w:line="480" w:lineRule="auto"/>
+        <w:rPr>
+          <w:rFonts w:ascii="Times New Roman" w:hAnsi="Times New Roman" w:cs="Times New Roman"/>
+        </w:rPr>
+      </w:pPr>
+    </w:p>
+    <w:p>
+      <w:pPr>
+        <w:pStyle w:val="Heading3"/>
+        <w:spacing w:line="480" w:lineRule="auto"/>
+        <w:rPr>
+          <w:lang w:val="en-US"/>
+        </w:rPr>
+      </w:pPr>
+      <w:bookmarkStart w:id="9" w:name="_Toc223968950"/>
+      <w:r>
+        <w:rPr>
+          <w:rStyle w:val="Heading1Char"/>
+          <w:rFonts w:ascii="Times New Roman" w:hAnsi="Times New Roman" w:cs="Times New Roman"/>
+          <w:b/>
+        </w:rPr>
+        <w:t>REFERENCES</w:t>
+      </w:r>
+      <w:bookmarkEnd w:id="9"/>
+    </w:p>
+    <w:p>
+      <w:pPr>
+        <w:spacing w:line="480" w:lineRule="auto"/>
+      </w:pPr>
+      <w:r>
+        <w:t>Russell, S., &amp; Norvig, P. Artificial Intelligence: A Modern Approach.</w:t>
+      </w:r>
+    </w:p>
+    <w:p>
+      <w:pPr>
+        <w:spacing w:line="480" w:lineRule="auto"/>
+      </w:pPr>
+      <w:r>
+        <w:t>Cisco Networking Basics – Wi</w:t>
+      </w:r>
+      <w:r>
+        <w:t>-</w:t>
+      </w:r>
+      <w:r>
+        <w:t>Fi Troubleshooting Guide.</w:t>
+      </w:r>
+    </w:p>
+    <w:p>
+      <w:pPr>
+        <w:spacing w:line="480" w:lineRule="auto"/>
+      </w:pPr>
+      <w:r>
+        <w:t>How‑To Geek – Common Wi</w:t>
+      </w:r>
+      <w:r>
+        <w:t>-</w:t>
+      </w:r>
+      <w:r>
+        <w:t>Fi Problems and How to Fix Them.</w:t>
+      </w:r>
+    </w:p>
+    <w:p>
+      <w:pPr>
+        <w:spacing w:line="480" w:lineRule="auto"/>
+      </w:pPr>
+      <w:r>
+        <w:t>GeeksforGeeks – Expert Systems in Artificial Intelligence.</w:t>
+      </w:r>
+    </w:p>
+    <w:p>
+      <w:pPr>
+        <w:spacing w:line="480" w:lineRule="auto"/>
+      </w:pPr>
+      <w:r>
+        <w:t>University lecture materials on Knowledge‑Based Systems.</w:t>
+      </w:r>
+    </w:p>
+    <w:p>
+      <w:pPr>
+        <w:spacing w:line="480" w:lineRule="auto"/>
+        <w:ind w:left="0" w:firstLine="0"/>
+        <w:rPr>
+          <w:lang w:val="en-US"/>
+        </w:rPr>
+      </w:pPr>
     </w:p>
     <w:p>
       <w:pPr>

</xml_diff>